<commit_message>
Vídeo 3.A.8 con la voz real: la mano no pasa de 1,6× en ninguna escena
- Restricción presupuestaria: el rótulo «deja de ser asequible» del gráfico pasa a
  $p_1'>p_1$ (texto en la pizarra, solo si aclara mucho).
- Maximización: los ejes y la recta se empiezan a dibujar durante Kuhn-Tucker y se
  quita la fórmula de la esquina, que repetía el rótulo del gráfico.
- Trazado: la raya de W̄ se escribe después de su letra (una raya sola no forma
  renglón y va tras lo que cubre).

Co-Authored-By: Claude Opus 5.5 <noreply@anthropic.com>
Claude-Session: https://claude.ai/code/session_015dNTYMnYeuZSNPwTVPoXNf
</commit_message>
<xml_diff>
--- a/oposicion/temario/tercer-ejercicio/3A08.docx
+++ b/oposicion/temario/tercer-ejercicio/3A08.docx
@@ -12934,7 +12934,7 @@
       <w:r>
         <w:drawing>
           <wp:inline>
-            <wp:extent cx="4700444" cy="1877731"/>
+            <wp:extent cx="4672920" cy="1877731"/>
             <wp:effectExtent b="0" l="0" r="0" t="0"/>
             <wp:docPr descr="" title="" id="95" name="Picture"/>
             <a:graphic>
@@ -12955,7 +12955,7 @@
                   <pic:spPr bwMode="auto">
                     <a:xfrm>
                       <a:off x="0" y="0"/>
-                      <a:ext cx="4700444" cy="1877731"/>
+                      <a:ext cx="4672920" cy="1877731"/>
                     </a:xfrm>
                     <a:prstGeom prst="rect">
                       <a:avLst/>

</xml_diff>

<commit_message>
3.A.8 al día con el canon: CRRA θ, preferencias macro (θ, φ, χ), renta no laboral W̄ en Becker, Θ y B en Rosen, remisión de la Cobb-Douglas al 3.A.11
Tema, gráfico de Rosen, guion, escenas del vídeo y ficha de repaso; reconstruido (PDF, HTML, Word, ficha) y verificado (0 errores).

Co-Authored-By: Claude Opus 5.5 <noreply@anthropic.com>
Claude-Session: https://claude.ai/code/session_015dNTYMnYeuZSNPwTVPoXNf
</commit_message>
<xml_diff>
--- a/oposicion/temario/tercer-ejercicio/3A08.docx
+++ b/oposicion/temario/tercer-ejercicio/3A08.docx
@@ -33799,9 +33799,16 @@
             </m:rPr>
             <m:t>+</m:t>
           </m:r>
-          <m:r>
-            <m:t>V</m:t>
-          </m:r>
+          <m:bar>
+            <m:barPr>
+              <m:pos m:val="top"/>
+            </m:barPr>
+            <m:e>
+              <m:r>
+                <m:t>W</m:t>
+              </m:r>
+            </m:e>
+          </m:bar>
           <m:r>
             <m:rPr>
               <m:sty m:val="p"/>
@@ -33930,15 +33937,22 @@
         <w:t xml:space="preserve"> </w:t>
       </w:r>
       <m:oMath>
-        <m:r>
-          <m:t>V</m:t>
-        </m:r>
+        <m:bar>
+          <m:barPr>
+            <m:pos m:val="top"/>
+          </m:barPr>
+          <m:e>
+            <m:r>
+              <m:t>W</m:t>
+            </m:r>
+          </m:e>
+        </m:bar>
       </m:oMath>
       <w:r>
         <w:t xml:space="preserve"> </w:t>
       </w:r>
       <w:r>
-        <w:t xml:space="preserve">la renta no laboral y</w:t>
+        <w:t xml:space="preserve">la renta no laboral (exógena) y</w:t>
       </w:r>
       <w:r>
         <w:t xml:space="preserve"> </w:t>
@@ -34096,9 +34110,16 @@
             </m:rPr>
             <m:t>+</m:t>
           </m:r>
-          <m:r>
-            <m:t>V</m:t>
-          </m:r>
+          <m:bar>
+            <m:barPr>
+              <m:pos m:val="top"/>
+            </m:barPr>
+            <m:e>
+              <m:r>
+                <m:t>W</m:t>
+              </m:r>
+            </m:e>
+          </m:bar>
           <m:r>
             <m:rPr>
               <m:sty m:val="p"/>
@@ -34908,7 +34929,7 @@
       <w:r>
         <w:drawing>
           <wp:inline>
-            <wp:extent cx="2908342" cy="2455729"/>
+            <wp:extent cx="2929749" cy="2455729"/>
             <wp:effectExtent b="0" l="0" r="0" t="0"/>
             <wp:docPr descr="" title="" id="203" name="Picture"/>
             <a:graphic>
@@ -34929,7 +34950,7 @@
                   <pic:spPr bwMode="auto">
                     <a:xfrm>
                       <a:off x="0" y="0"/>
-                      <a:ext cx="2908342" cy="2455729"/>
+                      <a:ext cx="2929749" cy="2455729"/>
                     </a:xfrm>
                     <a:prstGeom prst="rect">
                       <a:avLst/>
@@ -35353,7 +35374,7 @@
       </w:r>
       <m:oMath>
         <m:r>
-          <m:t>θ</m:t>
+          <m:t>Θ</m:t>
         </m:r>
         <m:d>
           <m:dPr>
@@ -35471,7 +35492,7 @@
               <m:t>;</m:t>
             </m:r>
             <m:r>
-              <m:t>π</m:t>
+              <m:t>B</m:t>
             </m:r>
           </m:e>
         </m:d>
@@ -35498,7 +35519,7 @@
       </w:r>
       <m:oMath>
         <m:r>
-          <m:t>π</m:t>
+          <m:t>B</m:t>
         </m:r>
       </m:oMath>
       <w:r>
@@ -49158,7 +49179,7 @@
     </w:p>
     <w:bookmarkEnd w:id="229"/>
     <w:bookmarkEnd w:id="230"/>
-    <w:bookmarkStart w:id="234" w:name="anexo:formas"/>
+    <w:bookmarkStart w:id="235" w:name="anexo:formas"/>
     <w:p>
       <w:pPr>
         <w:pStyle w:val="Heading1"/>
@@ -51209,7 +51230,7 @@
                               <m:t>−</m:t>
                             </m:r>
                             <m:r>
-                              <m:t>η</m:t>
+                              <m:t>θ</m:t>
                             </m:r>
                           </m:sup>
                         </m:sSup>
@@ -51234,7 +51255,7 @@
                           <m:t>−</m:t>
                         </m:r>
                         <m:r>
-                          <m:t>η</m:t>
+                          <m:t>θ</m:t>
                         </m:r>
                       </m:den>
                     </m:f>
@@ -51248,7 +51269,7 @@
                       <m:t>si </m:t>
                     </m:r>
                     <m:r>
-                      <m:t>η</m:t>
+                      <m:t>θ</m:t>
                     </m:r>
                     <m:r>
                       <m:rPr>
@@ -51269,7 +51290,7 @@
                       <m:t> </m:t>
                     </m:r>
                     <m:r>
-                      <m:t>η</m:t>
+                      <m:t>θ</m:t>
                     </m:r>
                     <m:r>
                       <m:rPr>
@@ -51309,7 +51330,7 @@
                       <m:t>si </m:t>
                     </m:r>
                     <m:r>
-                      <m:t>η</m:t>
+                      <m:t>θ</m:t>
                     </m:r>
                     <m:r>
                       <m:rPr>
@@ -51349,7 +51370,7 @@
       </w:r>
       <m:oMath>
         <m:r>
-          <m:t>η</m:t>
+          <m:t>θ</m:t>
         </m:r>
       </m:oMath>
       <w:r>
@@ -51369,7 +51390,7 @@
           <m:t>/</m:t>
         </m:r>
         <m:r>
-          <m:t>η</m:t>
+          <m:t>θ</m:t>
         </m:r>
       </m:oMath>
       <w:r>
@@ -51590,7 +51611,7 @@
                     <m:t>−</m:t>
                   </m:r>
                   <m:r>
-                    <m:t>σ</m:t>
+                    <m:t>θ</m:t>
                   </m:r>
                 </m:sup>
               </m:sSup>
@@ -51606,7 +51627,7 @@
                 <m:t>−</m:t>
               </m:r>
               <m:r>
-                <m:t>σ</m:t>
+                <m:t>θ</m:t>
               </m:r>
             </m:den>
           </m:f>
@@ -51649,7 +51670,7 @@
             <m:t> si </m:t>
           </m:r>
           <m:r>
-            <m:t>σ</m:t>
+            <m:t>θ</m:t>
           </m:r>
           <m:r>
             <m:rPr>
@@ -51751,7 +51772,7 @@
             <m:t> si </m:t>
           </m:r>
           <m:r>
-            <m:t>σ</m:t>
+            <m:t>θ</m:t>
           </m:r>
           <m:r>
             <m:rPr>
@@ -51820,7 +51841,7 @@
       </w:r>
       <m:oMath>
         <m:r>
-          <m:t>σ</m:t>
+          <m:t>θ</m:t>
         </m:r>
         <m:r>
           <m:rPr>
@@ -51840,7 +51861,7 @@
       </w:r>
       <m:oMath>
         <m:r>
-          <m:t>σ</m:t>
+          <m:t>θ</m:t>
         </m:r>
         <m:r>
           <m:rPr>
@@ -51963,7 +51984,7 @@
                 <m:t>−</m:t>
               </m:r>
               <m:r>
-                <m:t>σ</m:t>
+                <m:t>θ</m:t>
               </m:r>
             </m:den>
           </m:f>
@@ -51987,7 +52008,7 @@
                     <m:t>−</m:t>
                   </m:r>
                   <m:r>
-                    <m:t>ψ</m:t>
+                    <m:t>χ</m:t>
                   </m:r>
                   <m:r>
                     <m:t> </m:t>
@@ -52014,7 +52035,7 @@
                             <m:t>+</m:t>
                           </m:r>
                           <m:r>
-                            <m:t>θ</m:t>
+                            <m:t>φ</m:t>
                           </m:r>
                         </m:sup>
                       </m:sSup>
@@ -52030,7 +52051,7 @@
                         <m:t>+</m:t>
                       </m:r>
                       <m:r>
-                        <m:t>θ</m:t>
+                        <m:t>φ</m:t>
                       </m:r>
                     </m:den>
                   </m:f>
@@ -52048,7 +52069,7 @@
                 <m:t>−</m:t>
               </m:r>
               <m:r>
-                <m:t>σ</m:t>
+                <m:t>θ</m:t>
               </m:r>
             </m:sup>
           </m:sSup>
@@ -52076,7 +52097,7 @@
       </w:r>
       <m:oMath>
         <m:r>
-          <m:t>ψ</m:t>
+          <m:t>χ</m:t>
         </m:r>
         <m:sSup>
           <m:e>
@@ -52086,7 +52107,7 @@
           </m:e>
           <m:sup>
             <m:r>
-              <m:t>θ</m:t>
+              <m:t>φ</m:t>
             </m:r>
           </m:sup>
         </m:sSup>
@@ -52101,7 +52122,35 @@
         </m:r>
       </m:oMath>
       <w:r>
-        <w:t xml:space="preserve">, no depende del consumo:</w:t>
+        <w:t xml:space="preserve"> </w:t>
+      </w:r>
+      <w:r>
+        <w:t xml:space="preserve">(</w:t>
+      </w:r>
+      <m:oMath>
+        <m:r>
+          <m:t>φ</m:t>
+        </m:r>
+      </m:oMath>
+      <w:r>
+        <w:t xml:space="preserve"> </w:t>
+      </w:r>
+      <w:r>
+        <w:t xml:space="preserve">es la inversa de la elasticidad de Frisch y</w:t>
+      </w:r>
+      <w:r>
+        <w:t xml:space="preserve"> </w:t>
+      </w:r>
+      <m:oMath>
+        <m:r>
+          <m:t>χ</m:t>
+        </m:r>
+      </m:oMath>
+      <w:r>
+        <w:t xml:space="preserve"> </w:t>
+      </w:r>
+      <w:r>
+        <w:t xml:space="preserve">el peso de la desutilidad del trabajo), no depende del consumo:</w:t>
       </w:r>
       <w:r>
         <w:t xml:space="preserve"> </w:t>
@@ -52256,7 +52305,7 @@
                         <m:t>−</m:t>
                       </m:r>
                       <m:r>
-                        <m:t>ψ</m:t>
+                        <m:t>χ</m:t>
                       </m:r>
                       <m:sSubSup>
                         <m:e>
@@ -52271,7 +52320,16 @@
                         </m:sub>
                         <m:sup>
                           <m:r>
-                            <m:t>θ</m:t>
+                            <m:t>1</m:t>
+                          </m:r>
+                          <m:r>
+                            <m:rPr>
+                              <m:sty m:val="p"/>
+                            </m:rPr>
+                            <m:t>+</m:t>
+                          </m:r>
+                          <m:r>
+                            <m:t>φ</m:t>
                           </m:r>
                         </m:sup>
                       </m:sSubSup>
@@ -52301,7 +52359,7 @@
                     <m:t>−</m:t>
                   </m:r>
                   <m:r>
-                    <m:t>σ</m:t>
+                    <m:t>θ</m:t>
                   </m:r>
                 </m:sup>
               </m:sSup>
@@ -52326,7 +52384,7 @@
                 <m:t>−</m:t>
               </m:r>
               <m:r>
-                <m:t>σ</m:t>
+                <m:t>θ</m:t>
               </m:r>
             </m:den>
           </m:f>
@@ -52586,9 +52644,15 @@
       <w:r>
         <w:t xml:space="preserve">es constante y se obtienen las GHH.</w:t>
       </w:r>
-    </w:p>
-    <w:bookmarkEnd w:id="234"/>
-    <w:bookmarkStart w:id="236" w:name="anexo:sistemas"/>
+      <w:r>
+        <w:rPr>
+          <w:rStyle w:val="FootnoteReference"/>
+        </w:rPr>
+        <w:footnoteReference w:id="234"/>
+      </w:r>
+    </w:p>
+    <w:bookmarkEnd w:id="235"/>
+    <w:bookmarkStart w:id="237" w:name="anexo:sistemas"/>
     <w:p>
       <w:pPr>
         <w:pStyle w:val="Heading1"/>
@@ -54075,7 +54139,7 @@
         <w:rPr>
           <w:rStyle w:val="FootnoteReference"/>
         </w:rPr>
-        <w:footnoteReference w:id="235"/>
+        <w:footnoteReference w:id="236"/>
       </w:r>
     </w:p>
     <w:p>
@@ -54286,8 +54350,8 @@
         <w:t xml:space="preserve">.</w:t>
       </w:r>
     </w:p>
-    <w:bookmarkEnd w:id="236"/>
-    <w:bookmarkStart w:id="242" w:name="anexo:cardinal"/>
+    <w:bookmarkEnd w:id="237"/>
+    <w:bookmarkStart w:id="243" w:name="anexo:cardinal"/>
     <w:p>
       <w:pPr>
         <w:pStyle w:val="Heading1"/>
@@ -54395,7 +54459,7 @@
         <w:rPr>
           <w:rStyle w:val="FootnoteReference"/>
         </w:rPr>
-        <w:footnoteReference w:id="237"/>
+        <w:footnoteReference w:id="238"/>
       </w:r>
     </w:p>
     <w:p>
@@ -55326,7 +55390,7 @@
         <w:t xml:space="preserve">.</w:t>
       </w:r>
     </w:p>
-    <w:bookmarkStart w:id="241" w:name="fig:demanda-cardinal"/>
+    <w:bookmarkStart w:id="242" w:name="fig:demanda-cardinal"/>
     <w:p>
       <w:pPr>
         <w:pStyle w:val="ImageCaption"/>
@@ -55413,18 +55477,18 @@
           <wp:inline>
             <wp:extent cx="2960331" cy="2672861"/>
             <wp:effectExtent b="0" l="0" r="0" t="0"/>
-            <wp:docPr descr="" title="" id="239" name="Picture"/>
+            <wp:docPr descr="" title="" id="240" name="Picture"/>
             <a:graphic>
               <a:graphicData uri="http://schemas.openxmlformats.org/drawingml/2006/picture">
                 <pic:pic>
                   <pic:nvPicPr>
-                    <pic:cNvPr descr="C:\Users\vgutierrez\Documents\src\victorgutierrezmarcos.github.io-revision\oposicion\temario\fuentes\3A08\graficos/demanda-cardinal.png" id="240" name="Picture"/>
+                    <pic:cNvPr descr="C:\Users\vgutierrez\Documents\src\victorgutierrezmarcos.github.io-revision\oposicion\temario\fuentes\3A08\graficos/demanda-cardinal.png" id="241" name="Picture"/>
                     <pic:cNvPicPr>
                       <a:picLocks noChangeArrowheads="1" noChangeAspect="1"/>
                     </pic:cNvPicPr>
                   </pic:nvPicPr>
                   <pic:blipFill>
-                    <a:blip r:embed="rId238"/>
+                    <a:blip r:embed="rId239"/>
                     <a:stretch>
                       <a:fillRect/>
                     </a:stretch>
@@ -55451,7 +55515,7 @@
         </w:drawing>
       </w:r>
     </w:p>
-    <w:bookmarkEnd w:id="241"/>
+    <w:bookmarkEnd w:id="242"/>
     <w:p>
       <w:pPr>
         <w:pStyle w:val="Piedeimagen"/>
@@ -55922,8 +55986,8 @@
         <w:t xml:space="preserve">(el dinero) desaparece el efecto cruzado.</w:t>
       </w:r>
     </w:p>
-    <w:bookmarkEnd w:id="242"/>
-    <w:bookmarkStart w:id="247" w:name="anexo:lancaster"/>
+    <w:bookmarkEnd w:id="243"/>
+    <w:bookmarkStart w:id="248" w:name="anexo:lancaster"/>
     <w:p>
       <w:pPr>
         <w:pStyle w:val="Heading1"/>
@@ -57276,7 +57340,7 @@
         <w:t xml:space="preserve">.</w:t>
       </w:r>
     </w:p>
-    <w:bookmarkStart w:id="246" w:name="fig:lancaster-caracteristicas"/>
+    <w:bookmarkStart w:id="247" w:name="fig:lancaster-caracteristicas"/>
     <w:p>
       <w:pPr>
         <w:pStyle w:val="ImageCaption"/>
@@ -57300,18 +57364,18 @@
           <wp:inline>
             <wp:extent cx="3039844" cy="2483253"/>
             <wp:effectExtent b="0" l="0" r="0" t="0"/>
-            <wp:docPr descr="" title="" id="244" name="Picture"/>
+            <wp:docPr descr="" title="" id="245" name="Picture"/>
             <a:graphic>
               <a:graphicData uri="http://schemas.openxmlformats.org/drawingml/2006/picture">
                 <pic:pic>
                   <pic:nvPicPr>
-                    <pic:cNvPr descr="C:\Users\vgutierrez\Documents\src\victorgutierrezmarcos.github.io-revision\oposicion\temario\fuentes\3A08\graficos/lancaster-caracteristicas.png" id="245" name="Picture"/>
+                    <pic:cNvPr descr="C:\Users\vgutierrez\Documents\src\victorgutierrezmarcos.github.io-revision\oposicion\temario\fuentes\3A08\graficos/lancaster-caracteristicas.png" id="246" name="Picture"/>
                     <pic:cNvPicPr>
                       <a:picLocks noChangeArrowheads="1" noChangeAspect="1"/>
                     </pic:cNvPicPr>
                   </pic:nvPicPr>
                   <pic:blipFill>
-                    <a:blip r:embed="rId243"/>
+                    <a:blip r:embed="rId244"/>
                     <a:stretch>
                       <a:fillRect/>
                     </a:stretch>
@@ -57338,7 +57402,7 @@
         </w:drawing>
       </w:r>
     </w:p>
-    <w:bookmarkEnd w:id="246"/>
+    <w:bookmarkEnd w:id="247"/>
     <w:p>
       <w:pPr>
         <w:pStyle w:val="Piedeimagen"/>
@@ -57367,8 +57431,8 @@
         <w:t xml:space="preserve">.</w:t>
       </w:r>
     </w:p>
-    <w:bookmarkEnd w:id="247"/>
-    <w:bookmarkStart w:id="248" w:name="anexo:thaler"/>
+    <w:bookmarkEnd w:id="248"/>
+    <w:bookmarkStart w:id="249" w:name="anexo:thaler"/>
     <w:p>
       <w:pPr>
         <w:pStyle w:val="Heading1"/>
@@ -57646,8 +57710,8 @@
         <w:t xml:space="preserve">) y en la mercadotecnia.</w:t>
       </w:r>
     </w:p>
-    <w:bookmarkEnd w:id="248"/>
-    <w:bookmarkStart w:id="255" w:name="anexo:test"/>
+    <w:bookmarkEnd w:id="249"/>
+    <w:bookmarkStart w:id="256" w:name="anexo:test"/>
     <w:p>
       <w:pPr>
         <w:pStyle w:val="Heading1"/>
@@ -57666,7 +57730,7 @@
       <w:r>
         <w:t xml:space="preserve"> </w:t>
       </w:r>
-      <w:hyperlink r:id="rId249">
+      <w:hyperlink r:id="rId250">
         <w:r>
           <w:rPr>
             <w:rStyle w:val="Hyperlink"/>
@@ -57678,7 +57742,7 @@
         <w:t xml:space="preserve">.</w:t>
       </w:r>
     </w:p>
-    <w:bookmarkStart w:id="251" w:name="h.1.-bienes-males-y-bienes-neutrales"/>
+    <w:bookmarkStart w:id="252" w:name="h.1.-bienes-males-y-bienes-neutrales"/>
     <w:p>
       <w:pPr>
         <w:pStyle w:val="Heading2"/>
@@ -57695,7 +57759,7 @@
         <w:t xml:space="preserve">Se mira el signo de las utilidades marginales:</w:t>
       </w:r>
     </w:p>
-    <w:bookmarkStart w:id="250" w:name="tab:bienes-males"/>
+    <w:bookmarkStart w:id="251" w:name="tab:bienes-males"/>
     <w:p>
       <w:pPr>
         <w:pStyle w:val="TableCaption"/>
@@ -57980,7 +58044,7 @@
         </w:tc>
       </w:tr>
     </w:tbl>
-    <w:bookmarkEnd w:id="250"/>
+    <w:bookmarkEnd w:id="251"/>
     <w:p>
       <w:pPr>
         <w:pStyle w:val="BodyText"/>
@@ -58031,8 +58095,8 @@
         <w:t xml:space="preserve">de las curvas de indiferencia.</w:t>
       </w:r>
     </w:p>
-    <w:bookmarkEnd w:id="251"/>
-    <w:bookmarkStart w:id="252" w:name="Xc9c8c193e5a72457f83fc31c7faa72e344a72be"/>
+    <w:bookmarkEnd w:id="252"/>
+    <w:bookmarkStart w:id="253" w:name="Xc9c8c193e5a72457f83fc31c7faa72e344a72be"/>
     <w:p>
       <w:pPr>
         <w:pStyle w:val="Heading2"/>
@@ -58244,8 +58308,8 @@
         <w:t xml:space="preserve">(ecuación (4)).</w:t>
       </w:r>
     </w:p>
-    <w:bookmarkEnd w:id="252"/>
-    <w:bookmarkStart w:id="254" w:name="X8db722a61a1945106241b5f9d431566eac24d5b"/>
+    <w:bookmarkEnd w:id="253"/>
+    <w:bookmarkStart w:id="255" w:name="X8db722a61a1945106241b5f9d431566eac24d5b"/>
     <w:p>
       <w:pPr>
         <w:pStyle w:val="Heading2"/>
@@ -58442,7 +58506,7 @@
         <w:t xml:space="preserve">: lo que decide es la derivada total.</w:t>
       </w:r>
     </w:p>
-    <w:bookmarkStart w:id="253" w:name="tab:curvatura"/>
+    <w:bookmarkStart w:id="254" w:name="tab:curvatura"/>
     <w:p>
       <w:pPr>
         <w:pStyle w:val="TableCaption"/>
@@ -59141,7 +59205,7 @@
         </w:tc>
       </w:tr>
     </w:tbl>
-    <w:bookmarkEnd w:id="253"/>
+    <w:bookmarkEnd w:id="254"/>
     <w:p>
       <w:pPr>
         <w:pStyle w:val="BodyText"/>
@@ -59474,9 +59538,9 @@
         <w:br w:type="page"/>
       </w:r>
     </w:p>
-    <w:bookmarkEnd w:id="254"/>
     <w:bookmarkEnd w:id="255"/>
-    <w:bookmarkStart w:id="422" w:name="bibliography"/>
+    <w:bookmarkEnd w:id="256"/>
+    <w:bookmarkStart w:id="423" w:name="bibliography"/>
     <w:p>
       <w:pPr>
         <w:pStyle w:val="Heading1"/>
@@ -59485,8 +59549,8 @@
         <w:t xml:space="preserve">Bibliografía</w:t>
       </w:r>
     </w:p>
-    <w:bookmarkStart w:id="421" w:name="refs"/>
-    <w:bookmarkStart w:id="257" w:name="ref-Afriat1967Construction"/>
+    <w:bookmarkStart w:id="422" w:name="refs"/>
+    <w:bookmarkStart w:id="258" w:name="ref-Afriat1967Construction"/>
     <w:p>
       <w:pPr>
         <w:pStyle w:val="Bibliography"/>
@@ -59522,7 +59586,7 @@
       <w:r>
         <w:t xml:space="preserve"> </w:t>
       </w:r>
-      <w:hyperlink r:id="rId256">
+      <w:hyperlink r:id="rId257">
         <w:r>
           <w:rPr>
             <w:rStyle w:val="Hyperlink"/>
@@ -59534,8 +59598,8 @@
         <w:t xml:space="preserve">.</w:t>
       </w:r>
     </w:p>
-    <w:bookmarkEnd w:id="257"/>
-    <w:bookmarkStart w:id="259" w:name="ref-AguilarMateos2015Deaton"/>
+    <w:bookmarkEnd w:id="258"/>
+    <w:bookmarkStart w:id="260" w:name="ref-AguilarMateos2015Deaton"/>
     <w:p>
       <w:pPr>
         <w:pStyle w:val="Bibliography"/>
@@ -59568,7 +59632,7 @@
       <w:r>
         <w:t xml:space="preserve"> </w:t>
       </w:r>
-      <w:hyperlink r:id="rId258">
+      <w:hyperlink r:id="rId259">
         <w:r>
           <w:rPr>
             <w:rStyle w:val="Hyperlink"/>
@@ -59580,8 +59644,8 @@
         <w:t xml:space="preserve">.</w:t>
       </w:r>
     </w:p>
-    <w:bookmarkEnd w:id="259"/>
-    <w:bookmarkStart w:id="260" w:name="ref-Antonelli1886Teoria"/>
+    <w:bookmarkEnd w:id="260"/>
+    <w:bookmarkStart w:id="261" w:name="ref-Antonelli1886Teoria"/>
     <w:p>
       <w:pPr>
         <w:pStyle w:val="Bibliography"/>
@@ -59603,8 +59667,8 @@
         <w:t xml:space="preserve">. Pisa: Tipografia del Folchetto.</w:t>
       </w:r>
     </w:p>
-    <w:bookmarkEnd w:id="260"/>
-    <w:bookmarkStart w:id="262" w:name="ref-ArrowEtAl1961Capital"/>
+    <w:bookmarkEnd w:id="261"/>
+    <w:bookmarkStart w:id="263" w:name="ref-ArrowEtAl1961Capital"/>
     <w:p>
       <w:pPr>
         <w:pStyle w:val="Bibliography"/>
@@ -59640,7 +59704,7 @@
       <w:r>
         <w:t xml:space="preserve"> </w:t>
       </w:r>
-      <w:hyperlink r:id="rId261">
+      <w:hyperlink r:id="rId262">
         <w:r>
           <w:rPr>
             <w:rStyle w:val="Hyperlink"/>
@@ -59652,8 +59716,8 @@
         <w:t xml:space="preserve">.</w:t>
       </w:r>
     </w:p>
-    <w:bookmarkEnd w:id="262"/>
-    <w:bookmarkStart w:id="263" w:name="ref-ArrowEnthoven1961Quasi"/>
+    <w:bookmarkEnd w:id="263"/>
+    <w:bookmarkStart w:id="264" w:name="ref-ArrowEnthoven1961Quasi"/>
     <w:p>
       <w:pPr>
         <w:pStyle w:val="Bibliography"/>
@@ -59687,8 +59751,8 @@
         <w:t xml:space="preserve">29 (4): 779-800.</w:t>
       </w:r>
     </w:p>
-    <w:bookmarkEnd w:id="263"/>
-    <w:bookmarkStart w:id="264" w:name="ref-Barbe2006Edgeworth"/>
+    <w:bookmarkEnd w:id="264"/>
+    <w:bookmarkStart w:id="265" w:name="ref-Barbe2006Edgeworth"/>
     <w:p>
       <w:pPr>
         <w:pStyle w:val="Bibliography"/>
@@ -59710,8 +59774,8 @@
         <w:t xml:space="preserve">. Bellaterra: Universitat Autònoma de Barcelona, Servei de Publicacions.</w:t>
       </w:r>
     </w:p>
-    <w:bookmarkEnd w:id="264"/>
-    <w:bookmarkStart w:id="266" w:name="ref-Barten1967Slutsky"/>
+    <w:bookmarkEnd w:id="265"/>
+    <w:bookmarkStart w:id="267" w:name="ref-Barten1967Slutsky"/>
     <w:p>
       <w:pPr>
         <w:pStyle w:val="Bibliography"/>
@@ -59747,7 +59811,7 @@
       <w:r>
         <w:t xml:space="preserve"> </w:t>
       </w:r>
-      <w:hyperlink r:id="rId265">
+      <w:hyperlink r:id="rId266">
         <w:r>
           <w:rPr>
             <w:rStyle w:val="Hyperlink"/>
@@ -59759,8 +59823,8 @@
         <w:t xml:space="preserve">.</w:t>
       </w:r>
     </w:p>
-    <w:bookmarkEnd w:id="266"/>
-    <w:bookmarkStart w:id="268" w:name="ref-Barten1969Maximum"/>
+    <w:bookmarkEnd w:id="267"/>
+    <w:bookmarkStart w:id="269" w:name="ref-Barten1969Maximum"/>
     <w:p>
       <w:pPr>
         <w:pStyle w:val="Bibliography"/>
@@ -59796,7 +59860,7 @@
       <w:r>
         <w:t xml:space="preserve"> </w:t>
       </w:r>
-      <w:hyperlink r:id="rId267">
+      <w:hyperlink r:id="rId268">
         <w:r>
           <w:rPr>
             <w:rStyle w:val="Hyperlink"/>
@@ -59808,8 +59872,8 @@
         <w:t xml:space="preserve">.</w:t>
       </w:r>
     </w:p>
-    <w:bookmarkEnd w:id="268"/>
-    <w:bookmarkStart w:id="270" w:name="ref-Becker1965Allocation"/>
+    <w:bookmarkEnd w:id="269"/>
+    <w:bookmarkStart w:id="271" w:name="ref-Becker1965Allocation"/>
     <w:p>
       <w:pPr>
         <w:pStyle w:val="Bibliography"/>
@@ -59845,7 +59909,7 @@
       <w:r>
         <w:t xml:space="preserve"> </w:t>
       </w:r>
-      <w:hyperlink r:id="rId269">
+      <w:hyperlink r:id="rId270">
         <w:r>
           <w:rPr>
             <w:rStyle w:val="Hyperlink"/>
@@ -59857,8 +59921,8 @@
         <w:t xml:space="preserve">.</w:t>
       </w:r>
     </w:p>
-    <w:bookmarkEnd w:id="270"/>
-    <w:bookmarkStart w:id="272" w:name="ref-Bernoulli1738Specimen"/>
+    <w:bookmarkEnd w:id="271"/>
+    <w:bookmarkStart w:id="273" w:name="ref-Bernoulli1738Specimen"/>
     <w:p>
       <w:pPr>
         <w:pStyle w:val="Bibliography"/>
@@ -59894,7 +59958,7 @@
       <w:r>
         <w:t xml:space="preserve"> </w:t>
       </w:r>
-      <w:hyperlink r:id="rId271">
+      <w:hyperlink r:id="rId272">
         <w:r>
           <w:rPr>
             <w:rStyle w:val="Hyperlink"/>
@@ -59906,8 +59970,8 @@
         <w:t xml:space="preserve">.</w:t>
       </w:r>
     </w:p>
-    <w:bookmarkEnd w:id="272"/>
-    <w:bookmarkStart w:id="273" w:name="ref-BesankoBraeutigamGibbs2020"/>
+    <w:bookmarkEnd w:id="273"/>
+    <w:bookmarkStart w:id="274" w:name="ref-BesankoBraeutigamGibbs2020"/>
     <w:p>
       <w:pPr>
         <w:pStyle w:val="Bibliography"/>
@@ -59929,8 +59993,8 @@
         <w:t xml:space="preserve">. 6.ª ed. Hoboken: Wiley.</w:t>
       </w:r>
     </w:p>
-    <w:bookmarkEnd w:id="273"/>
-    <w:bookmarkStart w:id="274" w:name="ref-Boskin1996Toward"/>
+    <w:bookmarkEnd w:id="274"/>
+    <w:bookmarkStart w:id="275" w:name="ref-Boskin1996Toward"/>
     <w:p>
       <w:pPr>
         <w:pStyle w:val="Bibliography"/>
@@ -59948,8 +60012,8 @@
         <w:t xml:space="preserve">. Final Report to the Senate Finance Committee. Washington: Advisory Commission to Study the Consumer Price Index.</w:t>
       </w:r>
     </w:p>
-    <w:bookmarkEnd w:id="274"/>
-    <w:bookmarkStart w:id="275" w:name="ref-ChristensenJorgensonLau1975Utility"/>
+    <w:bookmarkEnd w:id="275"/>
+    <w:bookmarkStart w:id="276" w:name="ref-ChristensenJorgensonLau1975Utility"/>
     <w:p>
       <w:pPr>
         <w:pStyle w:val="Bibliography"/>
@@ -59983,8 +60047,8 @@
         <w:t xml:space="preserve">65 (3): 367-83.</w:t>
       </w:r>
     </w:p>
-    <w:bookmarkEnd w:id="275"/>
-    <w:bookmarkStart w:id="276" w:name="ref-CobbDouglas1928Theory"/>
+    <w:bookmarkEnd w:id="276"/>
+    <w:bookmarkStart w:id="277" w:name="ref-CobbDouglas1928Theory"/>
     <w:p>
       <w:pPr>
         <w:pStyle w:val="Bibliography"/>
@@ -60018,8 +60082,8 @@
         <w:t xml:space="preserve">18 (1, supl.): 139-65.</w:t>
       </w:r>
     </w:p>
-    <w:bookmarkEnd w:id="276"/>
-    <w:bookmarkStart w:id="278" w:name="ref-Court1939Hedonic"/>
+    <w:bookmarkEnd w:id="277"/>
+    <w:bookmarkStart w:id="279" w:name="ref-Court1939Hedonic"/>
     <w:p>
       <w:pPr>
         <w:pStyle w:val="Bibliography"/>
@@ -60052,7 +60116,7 @@
       <w:r>
         <w:t xml:space="preserve"> </w:t>
       </w:r>
-      <w:hyperlink r:id="rId277">
+      <w:hyperlink r:id="rId278">
         <w:r>
           <w:rPr>
             <w:rStyle w:val="Hyperlink"/>
@@ -60064,8 +60128,8 @@
         <w:t xml:space="preserve">.</w:t>
       </w:r>
     </w:p>
-    <w:bookmarkEnd w:id="278"/>
-    <w:bookmarkStart w:id="280" w:name="ref-Deaton1974Analysis"/>
+    <w:bookmarkEnd w:id="279"/>
+    <w:bookmarkStart w:id="281" w:name="ref-Deaton1974Analysis"/>
     <w:p>
       <w:pPr>
         <w:pStyle w:val="Bibliography"/>
@@ -60101,7 +60165,7 @@
       <w:r>
         <w:t xml:space="preserve"> </w:t>
       </w:r>
-      <w:hyperlink r:id="rId279">
+      <w:hyperlink r:id="rId280">
         <w:r>
           <w:rPr>
             <w:rStyle w:val="Hyperlink"/>
@@ -60113,8 +60177,8 @@
         <w:t xml:space="preserve">.</w:t>
       </w:r>
     </w:p>
-    <w:bookmarkEnd w:id="280"/>
-    <w:bookmarkStart w:id="281" w:name="ref-DeatonMuellbauer1980AIDS"/>
+    <w:bookmarkEnd w:id="281"/>
+    <w:bookmarkStart w:id="282" w:name="ref-DeatonMuellbauer1980AIDS"/>
     <w:p>
       <w:pPr>
         <w:pStyle w:val="Bibliography"/>
@@ -60148,8 +60212,8 @@
         <w:t xml:space="preserve">70 (3): 312-26.</w:t>
       </w:r>
     </w:p>
-    <w:bookmarkEnd w:id="281"/>
-    <w:bookmarkStart w:id="282" w:name="ref-DeatonMuellbauer1980Economics"/>
+    <w:bookmarkEnd w:id="282"/>
+    <w:bookmarkStart w:id="283" w:name="ref-DeatonMuellbauer1980Economics"/>
     <w:p>
       <w:pPr>
         <w:pStyle w:val="Bibliography"/>
@@ -60171,8 +60235,8 @@
         <w:t xml:space="preserve">. Cambridge: Cambridge University Press.</w:t>
       </w:r>
     </w:p>
-    <w:bookmarkEnd w:id="282"/>
-    <w:bookmarkStart w:id="284" w:name="ref-Debreu1959Theory"/>
+    <w:bookmarkEnd w:id="283"/>
+    <w:bookmarkStart w:id="285" w:name="ref-Debreu1959Theory"/>
     <w:p>
       <w:pPr>
         <w:pStyle w:val="Bibliography"/>
@@ -60196,7 +60260,7 @@
       <w:r>
         <w:t xml:space="preserve"> </w:t>
       </w:r>
-      <w:hyperlink r:id="rId283">
+      <w:hyperlink r:id="rId284">
         <w:r>
           <w:rPr>
             <w:rStyle w:val="Hyperlink"/>
@@ -60208,8 +60272,8 @@
         <w:t xml:space="preserve">.</w:t>
       </w:r>
     </w:p>
-    <w:bookmarkEnd w:id="284"/>
-    <w:bookmarkStart w:id="285" w:name="ref-Debreu1974Excess"/>
+    <w:bookmarkEnd w:id="285"/>
+    <w:bookmarkStart w:id="286" w:name="ref-Debreu1974Excess"/>
     <w:p>
       <w:pPr>
         <w:pStyle w:val="Bibliography"/>
@@ -60243,8 +60307,8 @@
         <w:t xml:space="preserve">1 (1): 15-21.</w:t>
       </w:r>
     </w:p>
-    <w:bookmarkEnd w:id="285"/>
-    <w:bookmarkStart w:id="286" w:name="ref-Dupuit1844Mesure"/>
+    <w:bookmarkEnd w:id="286"/>
+    <w:bookmarkStart w:id="287" w:name="ref-Dupuit1844Mesure"/>
     <w:p>
       <w:pPr>
         <w:pStyle w:val="Bibliography"/>
@@ -60275,8 +60339,8 @@
         <w:t xml:space="preserve">, 2.ª época, 8: 332-75.</w:t>
       </w:r>
     </w:p>
-    <w:bookmarkEnd w:id="286"/>
-    <w:bookmarkStart w:id="287" w:name="ref-Edgeworth1881Mathematical"/>
+    <w:bookmarkEnd w:id="287"/>
+    <w:bookmarkStart w:id="288" w:name="ref-Edgeworth1881Mathematical"/>
     <w:p>
       <w:pPr>
         <w:pStyle w:val="Bibliography"/>
@@ -60298,8 +60362,8 @@
         <w:t xml:space="preserve">. Londres: C. Kegan Paul.</w:t>
       </w:r>
     </w:p>
-    <w:bookmarkEnd w:id="287"/>
-    <w:bookmarkStart w:id="288" w:name="ref-EkelandHeckmanNesheim2004"/>
+    <w:bookmarkEnd w:id="288"/>
+    <w:bookmarkStart w:id="289" w:name="ref-EkelandHeckmanNesheim2004"/>
     <w:p>
       <w:pPr>
         <w:pStyle w:val="Bibliography"/>
@@ -60333,8 +60397,8 @@
         <w:t xml:space="preserve">112 (S1): S60-109.</w:t>
       </w:r>
     </w:p>
-    <w:bookmarkEnd w:id="288"/>
-    <w:bookmarkStart w:id="289" w:name="ref-EkelundHebert2013History"/>
+    <w:bookmarkEnd w:id="289"/>
+    <w:bookmarkStart w:id="290" w:name="ref-EkelundHebert2013History"/>
     <w:p>
       <w:pPr>
         <w:pStyle w:val="Bibliography"/>
@@ -60356,8 +60420,8 @@
         <w:t xml:space="preserve">. 6.ª ed. Long Grove (Illinois): Waveland Press.</w:t>
       </w:r>
     </w:p>
-    <w:bookmarkEnd w:id="289"/>
-    <w:bookmarkStart w:id="290" w:name="ref-Engel1857Productions"/>
+    <w:bookmarkEnd w:id="290"/>
+    <w:bookmarkStart w:id="291" w:name="ref-Engel1857Productions"/>
     <w:p>
       <w:pPr>
         <w:pStyle w:val="Bibliography"/>
@@ -60379,8 +60443,8 @@
         <w:t xml:space="preserve">. Dresde: Zeitschrift des Statistischen Bureaus des Königlich Sächsischen Ministeriums des Innern.</w:t>
       </w:r>
     </w:p>
-    <w:bookmarkEnd w:id="290"/>
-    <w:bookmarkStart w:id="292" w:name="ref-Eurostat2024HICPManual"/>
+    <w:bookmarkEnd w:id="291"/>
+    <w:bookmarkStart w:id="293" w:name="ref-Eurostat2024HICPManual"/>
     <w:p>
       <w:pPr>
         <w:pStyle w:val="Bibliography"/>
@@ -60400,7 +60464,7 @@
       <w:r>
         <w:t xml:space="preserve"> </w:t>
       </w:r>
-      <w:hyperlink r:id="rId291">
+      <w:hyperlink r:id="rId292">
         <w:r>
           <w:rPr>
             <w:rStyle w:val="Hyperlink"/>
@@ -60412,8 +60476,8 @@
         <w:t xml:space="preserve">.</w:t>
       </w:r>
     </w:p>
-    <w:bookmarkEnd w:id="292"/>
-    <w:bookmarkStart w:id="294" w:name="ref-Eurostat2026Nama10gdp"/>
+    <w:bookmarkEnd w:id="293"/>
+    <w:bookmarkStart w:id="295" w:name="ref-Eurostat2026Nama10gdp"/>
     <w:p>
       <w:pPr>
         <w:pStyle w:val="Bibliography"/>
@@ -60433,7 +60497,7 @@
       <w:r>
         <w:t xml:space="preserve"> </w:t>
       </w:r>
-      <w:hyperlink r:id="rId293">
+      <w:hyperlink r:id="rId294">
         <w:r>
           <w:rPr>
             <w:rStyle w:val="Hyperlink"/>
@@ -60445,8 +60509,8 @@
         <w:t xml:space="preserve">.</w:t>
       </w:r>
     </w:p>
-    <w:bookmarkEnd w:id="294"/>
-    <w:bookmarkStart w:id="295" w:name="ref-Fisher1892Mathematical"/>
+    <w:bookmarkEnd w:id="295"/>
+    <w:bookmarkStart w:id="296" w:name="ref-Fisher1892Mathematical"/>
     <w:p>
       <w:pPr>
         <w:pStyle w:val="Bibliography"/>
@@ -60468,8 +60532,8 @@
         <w:t xml:space="preserve">. Vol. 9. Transactions of the Connecticut Academy. New Haven: Connecticut Academy of Arts; Sciences.</w:t>
       </w:r>
     </w:p>
-    <w:bookmarkEnd w:id="295"/>
-    <w:bookmarkStart w:id="296" w:name="ref-Fisher1918Utility"/>
+    <w:bookmarkEnd w:id="296"/>
+    <w:bookmarkStart w:id="297" w:name="ref-Fisher1918Utility"/>
     <w:p>
       <w:pPr>
         <w:pStyle w:val="Bibliography"/>
@@ -60500,8 +60564,8 @@
         <w:t xml:space="preserve">8 (2): 335-37.</w:t>
       </w:r>
     </w:p>
-    <w:bookmarkEnd w:id="296"/>
-    <w:bookmarkStart w:id="297" w:name="ref-Friedman1953Methodology"/>
+    <w:bookmarkEnd w:id="297"/>
+    <w:bookmarkStart w:id="298" w:name="ref-Friedman1953Methodology"/>
     <w:p>
       <w:pPr>
         <w:pStyle w:val="Bibliography"/>
@@ -60532,8 +60596,8 @@
         <w:t xml:space="preserve">, 3-43. Chicago: University of Chicago Press.</w:t>
       </w:r>
     </w:p>
-    <w:bookmarkEnd w:id="297"/>
-    <w:bookmarkStart w:id="299" w:name="ref-FulekyAnatomy"/>
+    <w:bookmarkEnd w:id="298"/>
+    <w:bookmarkStart w:id="300" w:name="ref-FulekyAnatomy"/>
     <w:p>
       <w:pPr>
         <w:pStyle w:val="Bibliography"/>
@@ -60553,7 +60617,7 @@
       <w:r>
         <w:t xml:space="preserve"> </w:t>
       </w:r>
-      <w:hyperlink r:id="rId298">
+      <w:hyperlink r:id="rId299">
         <w:r>
           <w:rPr>
             <w:rStyle w:val="Hyperlink"/>
@@ -60565,8 +60629,8 @@
         <w:t xml:space="preserve">.</w:t>
       </w:r>
     </w:p>
-    <w:bookmarkEnd w:id="299"/>
-    <w:bookmarkStart w:id="301" w:name="ref-Geary1950Note"/>
+    <w:bookmarkEnd w:id="300"/>
+    <w:bookmarkStart w:id="302" w:name="ref-Geary1950Note"/>
     <w:p>
       <w:pPr>
         <w:pStyle w:val="Bibliography"/>
@@ -60602,7 +60666,7 @@
       <w:r>
         <w:t xml:space="preserve"> </w:t>
       </w:r>
-      <w:hyperlink r:id="rId300">
+      <w:hyperlink r:id="rId301">
         <w:r>
           <w:rPr>
             <w:rStyle w:val="Hyperlink"/>
@@ -60614,8 +60678,8 @@
         <w:t xml:space="preserve">.</w:t>
       </w:r>
     </w:p>
-    <w:bookmarkEnd w:id="301"/>
-    <w:bookmarkStart w:id="303" w:name="ref-Goodman1998Court"/>
+    <w:bookmarkEnd w:id="302"/>
+    <w:bookmarkStart w:id="304" w:name="ref-Goodman1998Court"/>
     <w:p>
       <w:pPr>
         <w:pStyle w:val="Bibliography"/>
@@ -60651,7 +60715,7 @@
       <w:r>
         <w:t xml:space="preserve"> </w:t>
       </w:r>
-      <w:hyperlink r:id="rId302">
+      <w:hyperlink r:id="rId303">
         <w:r>
           <w:rPr>
             <w:rStyle w:val="Hyperlink"/>
@@ -60663,8 +60727,8 @@
         <w:t xml:space="preserve">.</w:t>
       </w:r>
     </w:p>
-    <w:bookmarkEnd w:id="303"/>
-    <w:bookmarkStart w:id="305" w:name="ref-Gorman1953Community"/>
+    <w:bookmarkEnd w:id="304"/>
+    <w:bookmarkStart w:id="306" w:name="ref-Gorman1953Community"/>
     <w:p>
       <w:pPr>
         <w:pStyle w:val="Bibliography"/>
@@ -60700,7 +60764,7 @@
       <w:r>
         <w:t xml:space="preserve"> </w:t>
       </w:r>
-      <w:hyperlink r:id="rId304">
+      <w:hyperlink r:id="rId305">
         <w:r>
           <w:rPr>
             <w:rStyle w:val="Hyperlink"/>
@@ -60712,8 +60776,8 @@
         <w:t xml:space="preserve">.</w:t>
       </w:r>
     </w:p>
-    <w:bookmarkEnd w:id="305"/>
-    <w:bookmarkStart w:id="307" w:name="ref-Gorman1961Class"/>
+    <w:bookmarkEnd w:id="306"/>
+    <w:bookmarkStart w:id="308" w:name="ref-Gorman1961Class"/>
     <w:p>
       <w:pPr>
         <w:pStyle w:val="Bibliography"/>
@@ -60749,7 +60813,7 @@
       <w:r>
         <w:t xml:space="preserve"> </w:t>
       </w:r>
-      <w:hyperlink r:id="rId306">
+      <w:hyperlink r:id="rId307">
         <w:r>
           <w:rPr>
             <w:rStyle w:val="Hyperlink"/>
@@ -60761,8 +60825,8 @@
         <w:t xml:space="preserve">.</w:t>
       </w:r>
     </w:p>
-    <w:bookmarkEnd w:id="307"/>
-    <w:bookmarkStart w:id="308" w:name="ref-Gossen1854Entwickelung"/>
+    <w:bookmarkEnd w:id="308"/>
+    <w:bookmarkStart w:id="309" w:name="ref-Gossen1854Entwickelung"/>
     <w:p>
       <w:pPr>
         <w:pStyle w:val="Bibliography"/>
@@ -60784,8 +60848,8 @@
         <w:t xml:space="preserve">. Braunschweig: Vieweg.</w:t>
       </w:r>
     </w:p>
-    <w:bookmarkEnd w:id="308"/>
-    <w:bookmarkStart w:id="309" w:name="ref-GreenwoodHercowitzHuffman1988"/>
+    <w:bookmarkEnd w:id="309"/>
+    <w:bookmarkStart w:id="310" w:name="ref-GreenwoodHercowitzHuffman1988"/>
     <w:p>
       <w:pPr>
         <w:pStyle w:val="Bibliography"/>
@@ -60819,8 +60883,8 @@
         <w:t xml:space="preserve">78 (3): 402-17.</w:t>
       </w:r>
     </w:p>
-    <w:bookmarkEnd w:id="309"/>
-    <w:bookmarkStart w:id="311" w:name="ref-Griliches1961Hedonic"/>
+    <w:bookmarkEnd w:id="310"/>
+    <w:bookmarkStart w:id="312" w:name="ref-Griliches1961Hedonic"/>
     <w:p>
       <w:pPr>
         <w:pStyle w:val="Bibliography"/>
@@ -60853,7 +60917,7 @@
       <w:r>
         <w:t xml:space="preserve"> </w:t>
       </w:r>
-      <w:hyperlink r:id="rId310">
+      <w:hyperlink r:id="rId311">
         <w:r>
           <w:rPr>
             <w:rStyle w:val="Hyperlink"/>
@@ -60865,8 +60929,8 @@
         <w:t xml:space="preserve">.</w:t>
       </w:r>
     </w:p>
-    <w:bookmarkEnd w:id="311"/>
-    <w:bookmarkStart w:id="312" w:name="ref-Griliches1971Price"/>
+    <w:bookmarkEnd w:id="312"/>
+    <w:bookmarkStart w:id="313" w:name="ref-Griliches1971Price"/>
     <w:p>
       <w:pPr>
         <w:pStyle w:val="Bibliography"/>
@@ -60888,8 +60952,8 @@
         <w:t xml:space="preserve">. Cambridge (Mass.): Harvard University Press.</w:t>
       </w:r>
     </w:p>
-    <w:bookmarkEnd w:id="312"/>
-    <w:bookmarkStart w:id="314" w:name="ref-Gronau1977Leisure"/>
+    <w:bookmarkEnd w:id="313"/>
+    <w:bookmarkStart w:id="315" w:name="ref-Gronau1977Leisure"/>
     <w:p>
       <w:pPr>
         <w:pStyle w:val="Bibliography"/>
@@ -60925,7 +60989,7 @@
       <w:r>
         <w:t xml:space="preserve"> </w:t>
       </w:r>
-      <w:hyperlink r:id="rId313">
+      <w:hyperlink r:id="rId314">
         <w:r>
           <w:rPr>
             <w:rStyle w:val="Hyperlink"/>
@@ -60937,8 +61001,8 @@
         <w:t xml:space="preserve">.</w:t>
       </w:r>
     </w:p>
-    <w:bookmarkEnd w:id="314"/>
-    <w:bookmarkStart w:id="316" w:name="ref-HicksAllen1934Reconsideration"/>
+    <w:bookmarkEnd w:id="315"/>
+    <w:bookmarkStart w:id="317" w:name="ref-HicksAllen1934Reconsideration"/>
     <w:p>
       <w:pPr>
         <w:pStyle w:val="Bibliography"/>
@@ -60974,7 +61038,7 @@
       <w:r>
         <w:t xml:space="preserve"> </w:t>
       </w:r>
-      <w:hyperlink r:id="rId315">
+      <w:hyperlink r:id="rId316">
         <w:r>
           <w:rPr>
             <w:rStyle w:val="Hyperlink"/>
@@ -60986,8 +61050,8 @@
         <w:t xml:space="preserve">.</w:t>
       </w:r>
     </w:p>
-    <w:bookmarkEnd w:id="316"/>
-    <w:bookmarkStart w:id="318" w:name="ref-Houthakker1950Revealed"/>
+    <w:bookmarkEnd w:id="317"/>
+    <w:bookmarkStart w:id="319" w:name="ref-Houthakker1950Revealed"/>
     <w:p>
       <w:pPr>
         <w:pStyle w:val="Bibliography"/>
@@ -61023,7 +61087,7 @@
       <w:r>
         <w:t xml:space="preserve"> </w:t>
       </w:r>
-      <w:hyperlink r:id="rId317">
+      <w:hyperlink r:id="rId318">
         <w:r>
           <w:rPr>
             <w:rStyle w:val="Hyperlink"/>
@@ -61035,8 +61099,8 @@
         <w:t xml:space="preserve">.</w:t>
       </w:r>
     </w:p>
-    <w:bookmarkEnd w:id="318"/>
-    <w:bookmarkStart w:id="319" w:name="ref-HurwiczUzawa1971Integrability"/>
+    <w:bookmarkEnd w:id="319"/>
+    <w:bookmarkStart w:id="320" w:name="ref-HurwiczUzawa1971Integrability"/>
     <w:p>
       <w:pPr>
         <w:pStyle w:val="Bibliography"/>
@@ -61067,8 +61131,8 @@
         <w:t xml:space="preserve">, editado por John S. Chipman, Leonid Hurwicz, Marcel K. Richter, y Hugo F. Sonnenschein, 114-48. Nueva York: Harcourt Brace Jovanovich.</w:t>
       </w:r>
     </w:p>
-    <w:bookmarkEnd w:id="319"/>
-    <w:bookmarkStart w:id="321" w:name="ref-INE2008EPFCaracteristicas"/>
+    <w:bookmarkEnd w:id="320"/>
+    <w:bookmarkStart w:id="322" w:name="ref-INE2008EPFCaracteristicas"/>
     <w:p>
       <w:pPr>
         <w:pStyle w:val="Bibliography"/>
@@ -61088,7 +61152,7 @@
       <w:r>
         <w:t xml:space="preserve"> </w:t>
       </w:r>
-      <w:hyperlink r:id="rId320">
+      <w:hyperlink r:id="rId321">
         <w:r>
           <w:rPr>
             <w:rStyle w:val="Hyperlink"/>
@@ -61100,8 +61164,8 @@
         <w:t xml:space="preserve">.</w:t>
       </w:r>
     </w:p>
-    <w:bookmarkEnd w:id="321"/>
-    <w:bookmarkStart w:id="323" w:name="ref-INE2026CNTRDemanda"/>
+    <w:bookmarkEnd w:id="322"/>
+    <w:bookmarkStart w:id="324" w:name="ref-INE2026CNTRDemanda"/>
     <w:p>
       <w:pPr>
         <w:pStyle w:val="Bibliography"/>
@@ -61121,7 +61185,7 @@
       <w:r>
         <w:t xml:space="preserve"> </w:t>
       </w:r>
-      <w:hyperlink r:id="rId322">
+      <w:hyperlink r:id="rId323">
         <w:r>
           <w:rPr>
             <w:rStyle w:val="Hyperlink"/>
@@ -61133,8 +61197,8 @@
         <w:t xml:space="preserve">.</w:t>
       </w:r>
     </w:p>
-    <w:bookmarkEnd w:id="323"/>
-    <w:bookmarkStart w:id="325" w:name="ref-INE2026EPFTabla73828"/>
+    <w:bookmarkEnd w:id="324"/>
+    <w:bookmarkStart w:id="326" w:name="ref-INE2026EPFTabla73828"/>
     <w:p>
       <w:pPr>
         <w:pStyle w:val="Bibliography"/>
@@ -61154,7 +61218,7 @@
       <w:r>
         <w:t xml:space="preserve"> </w:t>
       </w:r>
-      <w:hyperlink r:id="rId324">
+      <w:hyperlink r:id="rId325">
         <w:r>
           <w:rPr>
             <w:rStyle w:val="Hyperlink"/>
@@ -61166,8 +61230,8 @@
         <w:t xml:space="preserve">.</w:t>
       </w:r>
     </w:p>
-    <w:bookmarkEnd w:id="325"/>
-    <w:bookmarkStart w:id="327" w:name="ref-INE2026IPCMetodologia"/>
+    <w:bookmarkEnd w:id="326"/>
+    <w:bookmarkStart w:id="328" w:name="ref-INE2026IPCMetodologia"/>
     <w:p>
       <w:pPr>
         <w:pStyle w:val="Bibliography"/>
@@ -61187,7 +61251,7 @@
       <w:r>
         <w:t xml:space="preserve"> </w:t>
       </w:r>
-      <w:hyperlink r:id="rId326">
+      <w:hyperlink r:id="rId327">
         <w:r>
           <w:rPr>
             <w:rStyle w:val="Hyperlink"/>
@@ -61199,8 +61263,8 @@
         <w:t xml:space="preserve">.</w:t>
       </w:r>
     </w:p>
-    <w:bookmarkEnd w:id="327"/>
-    <w:bookmarkStart w:id="329" w:name="ref-INE2026IPVMetodologia"/>
+    <w:bookmarkEnd w:id="328"/>
+    <w:bookmarkStart w:id="330" w:name="ref-INE2026IPVMetodologia"/>
     <w:p>
       <w:pPr>
         <w:pStyle w:val="Bibliography"/>
@@ -61220,7 +61284,7 @@
       <w:r>
         <w:t xml:space="preserve"> </w:t>
       </w:r>
-      <w:hyperlink r:id="rId328">
+      <w:hyperlink r:id="rId329">
         <w:r>
           <w:rPr>
             <w:rStyle w:val="Hyperlink"/>
@@ -61232,8 +61296,8 @@
         <w:t xml:space="preserve">.</w:t>
       </w:r>
     </w:p>
-    <w:bookmarkEnd w:id="329"/>
-    <w:bookmarkStart w:id="331" w:name="ref-INE2026EPF"/>
+    <w:bookmarkEnd w:id="330"/>
+    <w:bookmarkStart w:id="332" w:name="ref-INE2026EPF"/>
     <w:p>
       <w:pPr>
         <w:pStyle w:val="Bibliography"/>
@@ -61253,7 +61317,7 @@
       <w:r>
         <w:t xml:space="preserve"> </w:t>
       </w:r>
-      <w:hyperlink r:id="rId330">
+      <w:hyperlink r:id="rId331">
         <w:r>
           <w:rPr>
             <w:rStyle w:val="Hyperlink"/>
@@ -61265,8 +61329,8 @@
         <w:t xml:space="preserve">.</w:t>
       </w:r>
     </w:p>
-    <w:bookmarkEnd w:id="331"/>
-    <w:bookmarkStart w:id="333" w:name="ref-INEEPFMetodologia"/>
+    <w:bookmarkEnd w:id="332"/>
+    <w:bookmarkStart w:id="334" w:name="ref-INEEPFMetodologia"/>
     <w:p>
       <w:pPr>
         <w:pStyle w:val="Bibliography"/>
@@ -61286,7 +61350,7 @@
       <w:r>
         <w:t xml:space="preserve"> </w:t>
       </w:r>
-      <w:hyperlink r:id="rId332">
+      <w:hyperlink r:id="rId333">
         <w:r>
           <w:rPr>
             <w:rStyle w:val="Hyperlink"/>
@@ -61298,8 +61362,8 @@
         <w:t xml:space="preserve">.</w:t>
       </w:r>
     </w:p>
-    <w:bookmarkEnd w:id="333"/>
-    <w:bookmarkStart w:id="335" w:name="ref-JaimovichRebelo2009News"/>
+    <w:bookmarkEnd w:id="334"/>
+    <w:bookmarkStart w:id="336" w:name="ref-JaimovichRebelo2009News"/>
     <w:p>
       <w:pPr>
         <w:pStyle w:val="Bibliography"/>
@@ -61332,7 +61396,7 @@
       <w:r>
         <w:t xml:space="preserve"> </w:t>
       </w:r>
-      <w:hyperlink r:id="rId334">
+      <w:hyperlink r:id="rId335">
         <w:r>
           <w:rPr>
             <w:rStyle w:val="Hyperlink"/>
@@ -61344,8 +61408,8 @@
         <w:t xml:space="preserve">.</w:t>
       </w:r>
     </w:p>
-    <w:bookmarkEnd w:id="335"/>
-    <w:bookmarkStart w:id="336" w:name="ref-JehleReny2011Advanced"/>
+    <w:bookmarkEnd w:id="336"/>
+    <w:bookmarkStart w:id="337" w:name="ref-JehleReny2011Advanced"/>
     <w:p>
       <w:pPr>
         <w:pStyle w:val="Bibliography"/>
@@ -61367,8 +61431,8 @@
         <w:t xml:space="preserve">. 3.ª ed. Harlow: Financial Times/Prentice Hall.</w:t>
       </w:r>
     </w:p>
-    <w:bookmarkEnd w:id="336"/>
-    <w:bookmarkStart w:id="337" w:name="ref-JensenMiller2008Giffen"/>
+    <w:bookmarkEnd w:id="337"/>
+    <w:bookmarkStart w:id="338" w:name="ref-JensenMiller2008Giffen"/>
     <w:p>
       <w:pPr>
         <w:pStyle w:val="Bibliography"/>
@@ -61402,8 +61466,8 @@
         <w:t xml:space="preserve">98 (4): 1553-77.</w:t>
       </w:r>
     </w:p>
-    <w:bookmarkEnd w:id="337"/>
-    <w:bookmarkStart w:id="338" w:name="ref-KahnemanKnetschThaler1986Fairness"/>
+    <w:bookmarkEnd w:id="338"/>
+    <w:bookmarkStart w:id="339" w:name="ref-KahnemanKnetschThaler1986Fairness"/>
     <w:p>
       <w:pPr>
         <w:pStyle w:val="Bibliography"/>
@@ -61437,8 +61501,8 @@
         <w:t xml:space="preserve">76 (4): 728-41.</w:t>
       </w:r>
     </w:p>
-    <w:bookmarkEnd w:id="338"/>
-    <w:bookmarkStart w:id="340" w:name="ref-KahnemanKnetschThaler1990Endowment"/>
+    <w:bookmarkEnd w:id="339"/>
+    <w:bookmarkStart w:id="341" w:name="ref-KahnemanKnetschThaler1990Endowment"/>
     <w:p>
       <w:pPr>
         <w:pStyle w:val="Bibliography"/>
@@ -61474,7 +61538,7 @@
       <w:r>
         <w:t xml:space="preserve"> </w:t>
       </w:r>
-      <w:hyperlink r:id="rId339">
+      <w:hyperlink r:id="rId340">
         <w:r>
           <w:rPr>
             <w:rStyle w:val="Hyperlink"/>
@@ -61486,8 +61550,8 @@
         <w:t xml:space="preserve">.</w:t>
       </w:r>
     </w:p>
-    <w:bookmarkEnd w:id="340"/>
-    <w:bookmarkStart w:id="342" w:name="ref-KahnemanTversky1979Prospect"/>
+    <w:bookmarkEnd w:id="341"/>
+    <w:bookmarkStart w:id="343" w:name="ref-KahnemanTversky1979Prospect"/>
     <w:p>
       <w:pPr>
         <w:pStyle w:val="Bibliography"/>
@@ -61523,7 +61587,7 @@
       <w:r>
         <w:t xml:space="preserve"> </w:t>
       </w:r>
-      <w:hyperlink r:id="rId341">
+      <w:hyperlink r:id="rId342">
         <w:r>
           <w:rPr>
             <w:rStyle w:val="Hyperlink"/>
@@ -61535,8 +61599,8 @@
         <w:t xml:space="preserve">.</w:t>
       </w:r>
     </w:p>
-    <w:bookmarkEnd w:id="342"/>
-    <w:bookmarkStart w:id="344" w:name="ref-KahnemanTversky1984Choices"/>
+    <w:bookmarkEnd w:id="343"/>
+    <w:bookmarkStart w:id="345" w:name="ref-KahnemanTversky1984Choices"/>
     <w:p>
       <w:pPr>
         <w:pStyle w:val="Bibliography"/>
@@ -61572,7 +61636,7 @@
       <w:r>
         <w:t xml:space="preserve"> </w:t>
       </w:r>
-      <w:hyperlink r:id="rId343">
+      <w:hyperlink r:id="rId344">
         <w:r>
           <w:rPr>
             <w:rStyle w:val="Hyperlink"/>
@@ -61584,8 +61648,8 @@
         <w:t xml:space="preserve">.</w:t>
       </w:r>
     </w:p>
-    <w:bookmarkEnd w:id="344"/>
-    <w:bookmarkStart w:id="346" w:name="ref-KihlstromMasColellSonnenschein1976"/>
+    <w:bookmarkEnd w:id="345"/>
+    <w:bookmarkStart w:id="347" w:name="ref-KihlstromMasColellSonnenschein1976"/>
     <w:p>
       <w:pPr>
         <w:pStyle w:val="Bibliography"/>
@@ -61621,7 +61685,7 @@
       <w:r>
         <w:t xml:space="preserve"> </w:t>
       </w:r>
-      <w:hyperlink r:id="rId345">
+      <w:hyperlink r:id="rId346">
         <w:r>
           <w:rPr>
             <w:rStyle w:val="Hyperlink"/>
@@ -61633,8 +61697,8 @@
         <w:t xml:space="preserve">.</w:t>
       </w:r>
     </w:p>
-    <w:bookmarkEnd w:id="346"/>
-    <w:bookmarkStart w:id="348" w:name="ref-KingPlosserRebelo1988Production"/>
+    <w:bookmarkEnd w:id="347"/>
+    <w:bookmarkStart w:id="349" w:name="ref-KingPlosserRebelo1988Production"/>
     <w:p>
       <w:pPr>
         <w:pStyle w:val="Bibliography"/>
@@ -61670,7 +61734,7 @@
       <w:r>
         <w:t xml:space="preserve"> </w:t>
       </w:r>
-      <w:hyperlink r:id="rId347">
+      <w:hyperlink r:id="rId348">
         <w:r>
           <w:rPr>
             <w:rStyle w:val="Hyperlink"/>
@@ -61682,8 +61746,8 @@
         <w:t xml:space="preserve">.</w:t>
       </w:r>
     </w:p>
-    <w:bookmarkEnd w:id="348"/>
-    <w:bookmarkStart w:id="350" w:name="ref-KingPlosserRebelo2002Appendix"/>
+    <w:bookmarkEnd w:id="349"/>
+    <w:bookmarkStart w:id="351" w:name="ref-KingPlosserRebelo2002Appendix"/>
     <w:p>
       <w:pPr>
         <w:pStyle w:val="Bibliography"/>
@@ -61719,7 +61783,7 @@
       <w:r>
         <w:t xml:space="preserve"> </w:t>
       </w:r>
-      <w:hyperlink r:id="rId349">
+      <w:hyperlink r:id="rId350">
         <w:r>
           <w:rPr>
             <w:rStyle w:val="Hyperlink"/>
@@ -61731,8 +61795,8 @@
         <w:t xml:space="preserve">.</w:t>
       </w:r>
     </w:p>
-    <w:bookmarkEnd w:id="350"/>
-    <w:bookmarkStart w:id="351" w:name="ref-KuhnTucker1951Nonlinear"/>
+    <w:bookmarkEnd w:id="351"/>
+    <w:bookmarkStart w:id="352" w:name="ref-KuhnTucker1951Nonlinear"/>
     <w:p>
       <w:pPr>
         <w:pStyle w:val="Bibliography"/>
@@ -61763,8 +61827,8 @@
         <w:t xml:space="preserve">, editado por Jerzy Neyman, 481-92. Berkeley: University of California Press.</w:t>
       </w:r>
     </w:p>
-    <w:bookmarkEnd w:id="351"/>
-    <w:bookmarkStart w:id="353" w:name="ref-Nobel2017Thaler"/>
+    <w:bookmarkEnd w:id="352"/>
+    <w:bookmarkStart w:id="354" w:name="ref-Nobel2017Thaler"/>
     <w:p>
       <w:pPr>
         <w:pStyle w:val="Bibliography"/>
@@ -61784,7 +61848,7 @@
       <w:r>
         <w:t xml:space="preserve"> </w:t>
       </w:r>
-      <w:hyperlink r:id="rId352">
+      <w:hyperlink r:id="rId353">
         <w:r>
           <w:rPr>
             <w:rStyle w:val="Hyperlink"/>
@@ -61796,8 +61860,8 @@
         <w:t xml:space="preserve">.</w:t>
       </w:r>
     </w:p>
-    <w:bookmarkEnd w:id="353"/>
-    <w:bookmarkStart w:id="355" w:name="ref-Lancaster1966New"/>
+    <w:bookmarkEnd w:id="354"/>
+    <w:bookmarkStart w:id="356" w:name="ref-Lancaster1966New"/>
     <w:p>
       <w:pPr>
         <w:pStyle w:val="Bibliography"/>
@@ -61833,7 +61897,7 @@
       <w:r>
         <w:t xml:space="preserve"> </w:t>
       </w:r>
-      <w:hyperlink r:id="rId354">
+      <w:hyperlink r:id="rId355">
         <w:r>
           <w:rPr>
             <w:rStyle w:val="Hyperlink"/>
@@ -61845,8 +61909,8 @@
         <w:t xml:space="preserve">.</w:t>
       </w:r>
     </w:p>
-    <w:bookmarkEnd w:id="355"/>
-    <w:bookmarkStart w:id="356" w:name="ref-Leibenstein1950Bandwagon"/>
+    <w:bookmarkEnd w:id="356"/>
+    <w:bookmarkStart w:id="357" w:name="ref-Leibenstein1950Bandwagon"/>
     <w:p>
       <w:pPr>
         <w:pStyle w:val="Bibliography"/>
@@ -61880,8 +61944,8 @@
         <w:t xml:space="preserve">64 (2): 183-207.</w:t>
       </w:r>
     </w:p>
-    <w:bookmarkEnd w:id="356"/>
-    <w:bookmarkStart w:id="357" w:name="ref-Mantel1974Characterization"/>
+    <w:bookmarkEnd w:id="357"/>
+    <w:bookmarkStart w:id="358" w:name="ref-Mantel1974Characterization"/>
     <w:p>
       <w:pPr>
         <w:pStyle w:val="Bibliography"/>
@@ -61915,8 +61979,8 @@
         <w:t xml:space="preserve">7 (3): 348-53.</w:t>
       </w:r>
     </w:p>
-    <w:bookmarkEnd w:id="357"/>
-    <w:bookmarkStart w:id="359" w:name="ref-Markowitz1952Portfolio"/>
+    <w:bookmarkEnd w:id="358"/>
+    <w:bookmarkStart w:id="360" w:name="ref-Markowitz1952Portfolio"/>
     <w:p>
       <w:pPr>
         <w:pStyle w:val="Bibliography"/>
@@ -61952,7 +62016,7 @@
       <w:r>
         <w:t xml:space="preserve"> </w:t>
       </w:r>
-      <w:hyperlink r:id="rId358">
+      <w:hyperlink r:id="rId359">
         <w:r>
           <w:rPr>
             <w:rStyle w:val="Hyperlink"/>
@@ -61964,8 +62028,8 @@
         <w:t xml:space="preserve">.</w:t>
       </w:r>
     </w:p>
-    <w:bookmarkEnd w:id="359"/>
-    <w:bookmarkStart w:id="361" w:name="ref-Marshall1890Principles"/>
+    <w:bookmarkEnd w:id="360"/>
+    <w:bookmarkStart w:id="362" w:name="ref-Marshall1890Principles"/>
     <w:p>
       <w:pPr>
         <w:pStyle w:val="Bibliography"/>
@@ -61989,7 +62053,7 @@
       <w:r>
         <w:t xml:space="preserve"> </w:t>
       </w:r>
-      <w:hyperlink r:id="rId360">
+      <w:hyperlink r:id="rId361">
         <w:r>
           <w:rPr>
             <w:rStyle w:val="Hyperlink"/>
@@ -62001,8 +62065,8 @@
         <w:t xml:space="preserve">.</w:t>
       </w:r>
     </w:p>
-    <w:bookmarkEnd w:id="361"/>
-    <w:bookmarkStart w:id="362" w:name="ref-MasColellWhinstonGreen1995"/>
+    <w:bookmarkEnd w:id="362"/>
+    <w:bookmarkStart w:id="363" w:name="ref-MasColellWhinstonGreen1995"/>
     <w:p>
       <w:pPr>
         <w:pStyle w:val="Bibliography"/>
@@ -62024,8 +62088,8 @@
         <w:t xml:space="preserve">. Nueva York: Oxford University Press.</w:t>
       </w:r>
     </w:p>
-    <w:bookmarkEnd w:id="362"/>
-    <w:bookmarkStart w:id="364" w:name="ref-Muellbauer1975Aggregation"/>
+    <w:bookmarkEnd w:id="363"/>
+    <w:bookmarkStart w:id="365" w:name="ref-Muellbauer1975Aggregation"/>
     <w:p>
       <w:pPr>
         <w:pStyle w:val="Bibliography"/>
@@ -62061,7 +62125,7 @@
       <w:r>
         <w:t xml:space="preserve"> </w:t>
       </w:r>
-      <w:hyperlink r:id="rId363">
+      <w:hyperlink r:id="rId364">
         <w:r>
           <w:rPr>
             <w:rStyle w:val="Hyperlink"/>
@@ -62073,8 +62137,8 @@
         <w:t xml:space="preserve">.</w:t>
       </w:r>
     </w:p>
-    <w:bookmarkEnd w:id="364"/>
-    <w:bookmarkStart w:id="366" w:name="ref-Muellbauer1976Community"/>
+    <w:bookmarkEnd w:id="365"/>
+    <w:bookmarkStart w:id="367" w:name="ref-Muellbauer1976Community"/>
     <w:p>
       <w:pPr>
         <w:pStyle w:val="Bibliography"/>
@@ -62110,7 +62174,7 @@
       <w:r>
         <w:t xml:space="preserve"> </w:t>
       </w:r>
-      <w:hyperlink r:id="rId365">
+      <w:hyperlink r:id="rId366">
         <w:r>
           <w:rPr>
             <w:rStyle w:val="Hyperlink"/>
@@ -62122,8 +62186,8 @@
         <w:t xml:space="preserve">.</w:t>
       </w:r>
     </w:p>
-    <w:bookmarkEnd w:id="366"/>
-    <w:bookmarkStart w:id="368" w:name="ref-OsborneRubinstein2020Models"/>
+    <w:bookmarkEnd w:id="367"/>
+    <w:bookmarkStart w:id="369" w:name="ref-OsborneRubinstein2020Models"/>
     <w:p>
       <w:pPr>
         <w:pStyle w:val="Bibliography"/>
@@ -62147,7 +62211,7 @@
       <w:r>
         <w:t xml:space="preserve"> </w:t>
       </w:r>
-      <w:hyperlink r:id="rId367">
+      <w:hyperlink r:id="rId368">
         <w:r>
           <w:rPr>
             <w:rStyle w:val="Hyperlink"/>
@@ -62159,8 +62223,8 @@
         <w:t xml:space="preserve">.</w:t>
       </w:r>
     </w:p>
-    <w:bookmarkEnd w:id="368"/>
-    <w:bookmarkStart w:id="369" w:name="ref-Pareto1896Cours"/>
+    <w:bookmarkEnd w:id="369"/>
+    <w:bookmarkStart w:id="370" w:name="ref-Pareto1896Cours"/>
     <w:p>
       <w:pPr>
         <w:pStyle w:val="Bibliography"/>
@@ -62182,8 +62246,8 @@
         <w:t xml:space="preserve">. Lausana: F. Rouge.</w:t>
       </w:r>
     </w:p>
-    <w:bookmarkEnd w:id="369"/>
-    <w:bookmarkStart w:id="370" w:name="ref-Pareto1906Manuale"/>
+    <w:bookmarkEnd w:id="370"/>
+    <w:bookmarkStart w:id="371" w:name="ref-Pareto1906Manuale"/>
     <w:p>
       <w:pPr>
         <w:pStyle w:val="Bibliography"/>
@@ -62205,8 +62269,8 @@
         <w:t xml:space="preserve">. Milán: Società Editrice Libraria.</w:t>
       </w:r>
     </w:p>
-    <w:bookmarkEnd w:id="370"/>
-    <w:bookmarkStart w:id="371" w:name="ref-Perez2004Microeconomia"/>
+    <w:bookmarkEnd w:id="371"/>
+    <w:bookmarkStart w:id="372" w:name="ref-Perez2004Microeconomia"/>
     <w:p>
       <w:pPr>
         <w:pStyle w:val="Bibliography"/>
@@ -62228,8 +62292,8 @@
         <w:t xml:space="preserve">. Valladolid: Universidad de Valladolid.</w:t>
       </w:r>
     </w:p>
-    <w:bookmarkEnd w:id="371"/>
-    <w:bookmarkStart w:id="372" w:name="ref-Rose1958Consistency"/>
+    <w:bookmarkEnd w:id="372"/>
+    <w:bookmarkStart w:id="373" w:name="ref-Rose1958Consistency"/>
     <w:p>
       <w:pPr>
         <w:pStyle w:val="Bibliography"/>
@@ -62263,8 +62327,8 @@
         <w:t xml:space="preserve">25 (2): 124-25.</w:t>
       </w:r>
     </w:p>
-    <w:bookmarkEnd w:id="372"/>
-    <w:bookmarkStart w:id="374" w:name="ref-Rosen1974Hedonic"/>
+    <w:bookmarkEnd w:id="373"/>
+    <w:bookmarkStart w:id="375" w:name="ref-Rosen1974Hedonic"/>
     <w:p>
       <w:pPr>
         <w:pStyle w:val="Bibliography"/>
@@ -62300,7 +62364,7 @@
       <w:r>
         <w:t xml:space="preserve"> </w:t>
       </w:r>
-      <w:hyperlink r:id="rId373">
+      <w:hyperlink r:id="rId374">
         <w:r>
           <w:rPr>
             <w:rStyle w:val="Hyperlink"/>
@@ -62312,8 +62376,8 @@
         <w:t xml:space="preserve">.</w:t>
       </w:r>
     </w:p>
-    <w:bookmarkEnd w:id="374"/>
-    <w:bookmarkStart w:id="375" w:name="ref-Rosen1999Potato"/>
+    <w:bookmarkEnd w:id="375"/>
+    <w:bookmarkStart w:id="376" w:name="ref-Rosen1999Potato"/>
     <w:p>
       <w:pPr>
         <w:pStyle w:val="Bibliography"/>
@@ -62347,8 +62411,8 @@
         <w:t xml:space="preserve">107 (S6): S294-313.</w:t>
       </w:r>
     </w:p>
-    <w:bookmarkEnd w:id="375"/>
-    <w:bookmarkStart w:id="377" w:name="ref-Roy1947Distribution"/>
+    <w:bookmarkEnd w:id="376"/>
+    <w:bookmarkStart w:id="378" w:name="ref-Roy1947Distribution"/>
     <w:p>
       <w:pPr>
         <w:pStyle w:val="Bibliography"/>
@@ -62384,7 +62448,7 @@
       <w:r>
         <w:t xml:space="preserve"> </w:t>
       </w:r>
-      <w:hyperlink r:id="rId376">
+      <w:hyperlink r:id="rId377">
         <w:r>
           <w:rPr>
             <w:rStyle w:val="Hyperlink"/>
@@ -62396,8 +62460,8 @@
         <w:t xml:space="preserve">.</w:t>
       </w:r>
     </w:p>
-    <w:bookmarkEnd w:id="377"/>
-    <w:bookmarkStart w:id="379" w:name="ref-Samuelson1938Note"/>
+    <w:bookmarkEnd w:id="378"/>
+    <w:bookmarkStart w:id="380" w:name="ref-Samuelson1938Note"/>
     <w:p>
       <w:pPr>
         <w:pStyle w:val="Bibliography"/>
@@ -62433,7 +62497,7 @@
       <w:r>
         <w:t xml:space="preserve"> </w:t>
       </w:r>
-      <w:hyperlink r:id="rId378">
+      <w:hyperlink r:id="rId379">
         <w:r>
           <w:rPr>
             <w:rStyle w:val="Hyperlink"/>
@@ -62445,8 +62509,8 @@
         <w:t xml:space="preserve">.</w:t>
       </w:r>
     </w:p>
-    <w:bookmarkEnd w:id="379"/>
-    <w:bookmarkStart w:id="381" w:name="ref-Samuelson1948Consumption"/>
+    <w:bookmarkEnd w:id="380"/>
+    <w:bookmarkStart w:id="382" w:name="ref-Samuelson1948Consumption"/>
     <w:p>
       <w:pPr>
         <w:pStyle w:val="Bibliography"/>
@@ -62482,7 +62546,7 @@
       <w:r>
         <w:t xml:space="preserve"> </w:t>
       </w:r>
-      <w:hyperlink r:id="rId380">
+      <w:hyperlink r:id="rId381">
         <w:r>
           <w:rPr>
             <w:rStyle w:val="Hyperlink"/>
@@ -62494,8 +62558,8 @@
         <w:t xml:space="preserve">.</w:t>
       </w:r>
     </w:p>
-    <w:bookmarkEnd w:id="381"/>
-    <w:bookmarkStart w:id="382" w:name="ref-Segura1986Analisis"/>
+    <w:bookmarkEnd w:id="382"/>
+    <w:bookmarkStart w:id="383" w:name="ref-Segura1986Analisis"/>
     <w:p>
       <w:pPr>
         <w:pStyle w:val="Bibliography"/>
@@ -62517,8 +62581,8 @@
         <w:t xml:space="preserve">. Alianza Universidad Textos. Madrid: Alianza Editorial.</w:t>
       </w:r>
     </w:p>
-    <w:bookmarkEnd w:id="382"/>
-    <w:bookmarkStart w:id="383" w:name="ref-Sen1973Behaviour"/>
+    <w:bookmarkEnd w:id="383"/>
+    <w:bookmarkStart w:id="384" w:name="ref-Sen1973Behaviour"/>
     <w:p>
       <w:pPr>
         <w:pStyle w:val="Bibliography"/>
@@ -62552,8 +62616,8 @@
         <w:t xml:space="preserve">40 (159): 241-59.</w:t>
       </w:r>
     </w:p>
-    <w:bookmarkEnd w:id="383"/>
-    <w:bookmarkStart w:id="384" w:name="ref-Sen1977Rational"/>
+    <w:bookmarkEnd w:id="384"/>
+    <w:bookmarkStart w:id="385" w:name="ref-Sen1977Rational"/>
     <w:p>
       <w:pPr>
         <w:pStyle w:val="Bibliography"/>
@@ -62587,8 +62651,8 @@
         <w:t xml:space="preserve">6 (4): 317-44.</w:t>
       </w:r>
     </w:p>
-    <w:bookmarkEnd w:id="384"/>
-    <w:bookmarkStart w:id="386" w:name="ref-Simon1955Behavioral"/>
+    <w:bookmarkEnd w:id="385"/>
+    <w:bookmarkStart w:id="387" w:name="ref-Simon1955Behavioral"/>
     <w:p>
       <w:pPr>
         <w:pStyle w:val="Bibliography"/>
@@ -62624,7 +62688,7 @@
       <w:r>
         <w:t xml:space="preserve"> </w:t>
       </w:r>
-      <w:hyperlink r:id="rId385">
+      <w:hyperlink r:id="rId386">
         <w:r>
           <w:rPr>
             <w:rStyle w:val="Hyperlink"/>
@@ -62636,8 +62700,8 @@
         <w:t xml:space="preserve">.</w:t>
       </w:r>
     </w:p>
-    <w:bookmarkEnd w:id="386"/>
-    <w:bookmarkStart w:id="387" w:name="ref-Slutsky1915Bilancio"/>
+    <w:bookmarkEnd w:id="387"/>
+    <w:bookmarkStart w:id="388" w:name="ref-Slutsky1915Bilancio"/>
     <w:p>
       <w:pPr>
         <w:pStyle w:val="Bibliography"/>
@@ -62671,8 +62735,8 @@
         <w:t xml:space="preserve">51: 1-26.</w:t>
       </w:r>
     </w:p>
-    <w:bookmarkEnd w:id="387"/>
-    <w:bookmarkStart w:id="389" w:name="ref-Sonnenschein1973Walras"/>
+    <w:bookmarkEnd w:id="388"/>
+    <w:bookmarkStart w:id="390" w:name="ref-Sonnenschein1973Walras"/>
     <w:p>
       <w:pPr>
         <w:pStyle w:val="Bibliography"/>
@@ -62705,7 +62769,7 @@
       <w:r>
         <w:t xml:space="preserve"> </w:t>
       </w:r>
-      <w:hyperlink r:id="rId388">
+      <w:hyperlink r:id="rId389">
         <w:r>
           <w:rPr>
             <w:rStyle w:val="Hyperlink"/>
@@ -62717,8 +62781,8 @@
         <w:t xml:space="preserve">.</w:t>
       </w:r>
     </w:p>
-    <w:bookmarkEnd w:id="389"/>
-    <w:bookmarkStart w:id="391" w:name="ref-Starr1969Quasi"/>
+    <w:bookmarkEnd w:id="390"/>
+    <w:bookmarkStart w:id="392" w:name="ref-Starr1969Quasi"/>
     <w:p>
       <w:pPr>
         <w:pStyle w:val="Bibliography"/>
@@ -62754,7 +62818,7 @@
       <w:r>
         <w:t xml:space="preserve"> </w:t>
       </w:r>
-      <w:hyperlink r:id="rId390">
+      <w:hyperlink r:id="rId391">
         <w:r>
           <w:rPr>
             <w:rStyle w:val="Hyperlink"/>
@@ -62766,8 +62830,8 @@
         <w:t xml:space="preserve">.</w:t>
       </w:r>
     </w:p>
-    <w:bookmarkEnd w:id="391"/>
-    <w:bookmarkStart w:id="393" w:name="ref-Stigler1961Information"/>
+    <w:bookmarkEnd w:id="392"/>
+    <w:bookmarkStart w:id="394" w:name="ref-Stigler1961Information"/>
     <w:p>
       <w:pPr>
         <w:pStyle w:val="Bibliography"/>
@@ -62803,7 +62867,7 @@
       <w:r>
         <w:t xml:space="preserve"> </w:t>
       </w:r>
-      <w:hyperlink r:id="rId392">
+      <w:hyperlink r:id="rId393">
         <w:r>
           <w:rPr>
             <w:rStyle w:val="Hyperlink"/>
@@ -62815,8 +62879,8 @@
         <w:t xml:space="preserve">.</w:t>
       </w:r>
     </w:p>
-    <w:bookmarkEnd w:id="393"/>
-    <w:bookmarkStart w:id="395" w:name="ref-Stone1954Linear"/>
+    <w:bookmarkEnd w:id="394"/>
+    <w:bookmarkStart w:id="396" w:name="ref-Stone1954Linear"/>
     <w:p>
       <w:pPr>
         <w:pStyle w:val="Bibliography"/>
@@ -62852,7 +62916,7 @@
       <w:r>
         <w:t xml:space="preserve"> </w:t>
       </w:r>
-      <w:hyperlink r:id="rId394">
+      <w:hyperlink r:id="rId395">
         <w:r>
           <w:rPr>
             <w:rStyle w:val="Hyperlink"/>
@@ -62864,8 +62928,8 @@
         <w:t xml:space="preserve">.</w:t>
       </w:r>
     </w:p>
-    <w:bookmarkEnd w:id="395"/>
-    <w:bookmarkStart w:id="396" w:name="ref-SydsaeterEtAl2008Further"/>
+    <w:bookmarkEnd w:id="396"/>
+    <w:bookmarkStart w:id="397" w:name="ref-SydsaeterEtAl2008Further"/>
     <w:p>
       <w:pPr>
         <w:pStyle w:val="Bibliography"/>
@@ -62887,8 +62951,8 @@
         <w:t xml:space="preserve">. 2.ª ed. Harlow: Financial Times/Prentice Hall.</w:t>
       </w:r>
     </w:p>
-    <w:bookmarkEnd w:id="396"/>
-    <w:bookmarkStart w:id="398" w:name="ref-Thaler1980Positive"/>
+    <w:bookmarkEnd w:id="397"/>
+    <w:bookmarkStart w:id="399" w:name="ref-Thaler1980Positive"/>
     <w:p>
       <w:pPr>
         <w:pStyle w:val="Bibliography"/>
@@ -62924,7 +62988,7 @@
       <w:r>
         <w:t xml:space="preserve"> </w:t>
       </w:r>
-      <w:hyperlink r:id="rId397">
+      <w:hyperlink r:id="rId398">
         <w:r>
           <w:rPr>
             <w:rStyle w:val="Hyperlink"/>
@@ -62936,8 +63000,8 @@
         <w:t xml:space="preserve">.</w:t>
       </w:r>
     </w:p>
-    <w:bookmarkEnd w:id="398"/>
-    <w:bookmarkStart w:id="400" w:name="ref-Thaler1985Mental"/>
+    <w:bookmarkEnd w:id="399"/>
+    <w:bookmarkStart w:id="401" w:name="ref-Thaler1985Mental"/>
     <w:p>
       <w:pPr>
         <w:pStyle w:val="Bibliography"/>
@@ -62973,7 +63037,7 @@
       <w:r>
         <w:t xml:space="preserve"> </w:t>
       </w:r>
-      <w:hyperlink r:id="rId399">
+      <w:hyperlink r:id="rId400">
         <w:r>
           <w:rPr>
             <w:rStyle w:val="Hyperlink"/>
@@ -62985,8 +63049,8 @@
         <w:t xml:space="preserve">.</w:t>
       </w:r>
     </w:p>
-    <w:bookmarkEnd w:id="400"/>
-    <w:bookmarkStart w:id="402" w:name="ref-Nobel1970Samuelson"/>
+    <w:bookmarkEnd w:id="401"/>
+    <w:bookmarkStart w:id="403" w:name="ref-Nobel1970Samuelson"/>
     <w:p>
       <w:pPr>
         <w:pStyle w:val="Bibliography"/>
@@ -63006,7 +63070,7 @@
       <w:r>
         <w:t xml:space="preserve"> </w:t>
       </w:r>
-      <w:hyperlink r:id="rId401">
+      <w:hyperlink r:id="rId402">
         <w:r>
           <w:rPr>
             <w:rStyle w:val="Hyperlink"/>
@@ -63018,8 +63082,8 @@
         <w:t xml:space="preserve">.</w:t>
       </w:r>
     </w:p>
-    <w:bookmarkEnd w:id="402"/>
-    <w:bookmarkStart w:id="404" w:name="ref-Nobel1992Becker"/>
+    <w:bookmarkEnd w:id="403"/>
+    <w:bookmarkStart w:id="405" w:name="ref-Nobel1992Becker"/>
     <w:p>
       <w:pPr>
         <w:pStyle w:val="Bibliography"/>
@@ -63039,7 +63103,7 @@
       <w:r>
         <w:t xml:space="preserve"> </w:t>
       </w:r>
-      <w:hyperlink r:id="rId403">
+      <w:hyperlink r:id="rId404">
         <w:r>
           <w:rPr>
             <w:rStyle w:val="Hyperlink"/>
@@ -63051,8 +63115,8 @@
         <w:t xml:space="preserve">.</w:t>
       </w:r>
     </w:p>
-    <w:bookmarkEnd w:id="404"/>
-    <w:bookmarkStart w:id="406" w:name="ref-Nobel2015Deaton"/>
+    <w:bookmarkEnd w:id="405"/>
+    <w:bookmarkStart w:id="407" w:name="ref-Nobel2015Deaton"/>
     <w:p>
       <w:pPr>
         <w:pStyle w:val="Bibliography"/>
@@ -63072,7 +63136,7 @@
       <w:r>
         <w:t xml:space="preserve"> </w:t>
       </w:r>
-      <w:hyperlink r:id="rId405">
+      <w:hyperlink r:id="rId406">
         <w:r>
           <w:rPr>
             <w:rStyle w:val="Hyperlink"/>
@@ -63084,8 +63148,8 @@
         <w:t xml:space="preserve">.</w:t>
       </w:r>
     </w:p>
-    <w:bookmarkEnd w:id="406"/>
-    <w:bookmarkStart w:id="408" w:name="ref-Theil1965Information"/>
+    <w:bookmarkEnd w:id="407"/>
+    <w:bookmarkStart w:id="409" w:name="ref-Theil1965Information"/>
     <w:p>
       <w:pPr>
         <w:pStyle w:val="Bibliography"/>
@@ -63121,7 +63185,7 @@
       <w:r>
         <w:t xml:space="preserve"> </w:t>
       </w:r>
-      <w:hyperlink r:id="rId407">
+      <w:hyperlink r:id="rId408">
         <w:r>
           <w:rPr>
             <w:rStyle w:val="Hyperlink"/>
@@ -63133,8 +63197,8 @@
         <w:t xml:space="preserve">.</w:t>
       </w:r>
     </w:p>
-    <w:bookmarkEnd w:id="408"/>
-    <w:bookmarkStart w:id="410" w:name="ref-Triplett2006Handbook"/>
+    <w:bookmarkEnd w:id="409"/>
+    <w:bookmarkStart w:id="411" w:name="ref-Triplett2006Handbook"/>
     <w:p>
       <w:pPr>
         <w:pStyle w:val="Bibliography"/>
@@ -63158,7 +63222,7 @@
       <w:r>
         <w:t xml:space="preserve"> </w:t>
       </w:r>
-      <w:hyperlink r:id="rId409">
+      <w:hyperlink r:id="rId410">
         <w:r>
           <w:rPr>
             <w:rStyle w:val="Hyperlink"/>
@@ -63170,8 +63234,8 @@
         <w:t xml:space="preserve">.</w:t>
       </w:r>
     </w:p>
-    <w:bookmarkEnd w:id="410"/>
-    <w:bookmarkStart w:id="412" w:name="ref-TverskyKahneman1981Framing"/>
+    <w:bookmarkEnd w:id="411"/>
+    <w:bookmarkStart w:id="413" w:name="ref-TverskyKahneman1981Framing"/>
     <w:p>
       <w:pPr>
         <w:pStyle w:val="Bibliography"/>
@@ -63207,7 +63271,7 @@
       <w:r>
         <w:t xml:space="preserve"> </w:t>
       </w:r>
-      <w:hyperlink r:id="rId411">
+      <w:hyperlink r:id="rId412">
         <w:r>
           <w:rPr>
             <w:rStyle w:val="Hyperlink"/>
@@ -63219,8 +63283,8 @@
         <w:t xml:space="preserve">.</w:t>
       </w:r>
     </w:p>
-    <w:bookmarkEnd w:id="412"/>
-    <w:bookmarkStart w:id="414" w:name="ref-BLS2026QualityAdjustment"/>
+    <w:bookmarkEnd w:id="413"/>
+    <w:bookmarkStart w:id="415" w:name="ref-BLS2026QualityAdjustment"/>
     <w:p>
       <w:pPr>
         <w:pStyle w:val="Bibliography"/>
@@ -63240,7 +63304,7 @@
       <w:r>
         <w:t xml:space="preserve"> </w:t>
       </w:r>
-      <w:hyperlink r:id="rId413">
+      <w:hyperlink r:id="rId414">
         <w:r>
           <w:rPr>
             <w:rStyle w:val="Hyperlink"/>
@@ -63252,8 +63316,8 @@
         <w:t xml:space="preserve">.</w:t>
       </w:r>
     </w:p>
-    <w:bookmarkEnd w:id="414"/>
-    <w:bookmarkStart w:id="416" w:name="ref-Varian1982Nonparametric"/>
+    <w:bookmarkEnd w:id="415"/>
+    <w:bookmarkStart w:id="417" w:name="ref-Varian1982Nonparametric"/>
     <w:p>
       <w:pPr>
         <w:pStyle w:val="Bibliography"/>
@@ -63289,7 +63353,7 @@
       <w:r>
         <w:t xml:space="preserve"> </w:t>
       </w:r>
-      <w:hyperlink r:id="rId415">
+      <w:hyperlink r:id="rId416">
         <w:r>
           <w:rPr>
             <w:rStyle w:val="Hyperlink"/>
@@ -63301,8 +63365,8 @@
         <w:t xml:space="preserve">.</w:t>
       </w:r>
     </w:p>
-    <w:bookmarkEnd w:id="416"/>
-    <w:bookmarkStart w:id="417" w:name="ref-Varian2016Intermedia"/>
+    <w:bookmarkEnd w:id="417"/>
+    <w:bookmarkStart w:id="418" w:name="ref-Varian2016Intermedia"/>
     <w:p>
       <w:pPr>
         <w:pStyle w:val="Bibliography"/>
@@ -63324,8 +63388,8 @@
         <w:t xml:space="preserve">. Traducido por María Esther Rabasco. 9.ª ed. Barcelona: Antoni Bosch.</w:t>
       </w:r>
     </w:p>
-    <w:bookmarkEnd w:id="417"/>
-    <w:bookmarkStart w:id="418" w:name="ref-Veblen1899Leisure"/>
+    <w:bookmarkEnd w:id="418"/>
+    <w:bookmarkStart w:id="419" w:name="ref-Veblen1899Leisure"/>
     <w:p>
       <w:pPr>
         <w:pStyle w:val="Bibliography"/>
@@ -63347,8 +63411,8 @@
         <w:t xml:space="preserve">. Nueva York: Macmillan.</w:t>
       </w:r>
     </w:p>
-    <w:bookmarkEnd w:id="418"/>
-    <w:bookmarkStart w:id="419" w:name="ref-VialZurita2011Microeconomia"/>
+    <w:bookmarkEnd w:id="419"/>
+    <w:bookmarkStart w:id="420" w:name="ref-VialZurita2011Microeconomia"/>
     <w:p>
       <w:pPr>
         <w:pStyle w:val="Bibliography"/>
@@ -63370,8 +63434,8 @@
         <w:t xml:space="preserve">. Santiago de Chile: Ediciones Universidad Católica de Chile.</w:t>
       </w:r>
     </w:p>
-    <w:bookmarkEnd w:id="419"/>
-    <w:bookmarkStart w:id="420" w:name="ref-Walras1874Elements"/>
+    <w:bookmarkEnd w:id="420"/>
+    <w:bookmarkStart w:id="421" w:name="ref-Walras1874Elements"/>
     <w:p>
       <w:pPr>
         <w:pStyle w:val="Bibliography"/>
@@ -63393,9 +63457,9 @@
         <w:t xml:space="preserve">. Lausana: Corbaz.</w:t>
       </w:r>
     </w:p>
-    <w:bookmarkEnd w:id="420"/>
     <w:bookmarkEnd w:id="421"/>
     <w:bookmarkEnd w:id="422"/>
+    <w:bookmarkEnd w:id="423"/>
     <w:sectPr>
       <w:headerReference r:id="rId9" w:type="default"/>
       <w:footerReference r:id="rId10" w:type="default"/>
@@ -68414,7 +68478,19 @@
         <w:t xml:space="preserve">)</w:t>
       </w:r>
       <w:r>
-        <w:t xml:space="preserve">, que la usaron como función de producción.</w:t>
+        <w:t xml:space="preserve">, que la usaron como función de producción</w:t>
+      </w:r>
+      <w:r>
+        <w:t xml:space="preserve"> </w:t>
+      </w:r>
+      <w:r>
+        <w:rPr>
+          <w:rStyle w:val="Referenciaatema"/>
+        </w:rPr>
+        <w:t xml:space="preserve">[ver tema 3.A.11]</w:t>
+      </w:r>
+      <w:r>
+        <w:t xml:space="preserve">.</w:t>
       </w:r>
     </w:p>
   </w:footnote>
@@ -68529,7 +68605,7 @@
       </w:r>
       <m:oMath>
         <m:r>
-          <m:t>η</m:t>
+          <m:t>θ</m:t>
         </m:r>
         <m:r>
           <m:rPr>
@@ -68566,7 +68642,102 @@
       </w:r>
     </w:p>
   </w:footnote>
-  <w:footnote w:id="235">
+  <w:footnote w:id="234">
+    <w:p>
+      <w:pPr>
+        <w:pStyle w:val="FootnoteText"/>
+      </w:pPr>
+      <w:r>
+        <w:rPr>
+          <w:rStyle w:val="FootnoteReference"/>
+        </w:rPr>
+        <w:footnoteRef/>
+      </w:r>
+      <w:r>
+        <w:t xml:space="preserve"> </w:t>
+      </w:r>
+      <w:r>
+        <w:t xml:space="preserve">Jaimovich y Rebelo (</w:t>
+      </w:r>
+      <w:hyperlink w:anchor="ref-JaimovichRebelo2009News">
+        <w:r>
+          <w:rPr>
+            <w:rStyle w:val="Hyperlink"/>
+          </w:rPr>
+          <w:t xml:space="preserve">2009</w:t>
+        </w:r>
+      </w:hyperlink>
+      <w:r>
+        <w:t xml:space="preserve">)</w:t>
+      </w:r>
+      <w:r>
+        <w:t xml:space="preserve"> </w:t>
+      </w:r>
+      <w:r>
+        <w:t xml:space="preserve">escriben el exponente de las horas como</w:t>
+      </w:r>
+      <w:r>
+        <w:t xml:space="preserve"> </w:t>
+      </w:r>
+      <m:oMath>
+        <m:r>
+          <m:t>θ</m:t>
+        </m:r>
+      </m:oMath>
+      <w:r>
+        <w:t xml:space="preserve">; aquí es</w:t>
+      </w:r>
+      <w:r>
+        <w:t xml:space="preserve"> </w:t>
+      </w:r>
+      <m:oMath>
+        <m:r>
+          <m:t>1</m:t>
+        </m:r>
+        <m:r>
+          <m:rPr>
+            <m:sty m:val="p"/>
+          </m:rPr>
+          <m:t>+</m:t>
+        </m:r>
+        <m:r>
+          <m:t>φ</m:t>
+        </m:r>
+      </m:oMath>
+      <w:r>
+        <w:t xml:space="preserve">, para que</w:t>
+      </w:r>
+      <w:r>
+        <w:t xml:space="preserve"> </w:t>
+      </w:r>
+      <m:oMath>
+        <m:r>
+          <m:t>φ</m:t>
+        </m:r>
+      </m:oMath>
+      <w:r>
+        <w:t xml:space="preserve"> </w:t>
+      </w:r>
+      <w:r>
+        <w:t xml:space="preserve">sea también la inversa de la elasticidad de Frisch y</w:t>
+      </w:r>
+      <w:r>
+        <w:t xml:space="preserve"> </w:t>
+      </w:r>
+      <m:oMath>
+        <m:r>
+          <m:t>θ</m:t>
+        </m:r>
+      </m:oMath>
+      <w:r>
+        <w:t xml:space="preserve"> </w:t>
+      </w:r>
+      <w:r>
+        <w:t xml:space="preserve">quede para la aversión relativa al riesgo.</w:t>
+      </w:r>
+    </w:p>
+  </w:footnote>
+  <w:footnote w:id="236">
     <w:p>
       <w:pPr>
         <w:pStyle w:val="FootnoteText"/>
@@ -68614,7 +68785,7 @@
       </w:r>
     </w:p>
   </w:footnote>
-  <w:footnote w:id="237">
+  <w:footnote w:id="238">
     <w:p>
       <w:pPr>
         <w:pStyle w:val="FootnoteText"/>

</xml_diff>

<commit_message>
Citas sin coma antes de la «y» final (estilo tcee.csl) y figuras de la web con el ancho del tema; 3.A.8 y 3.A.11 reconstruidos
Co-Authored-By: Claude Opus 5.5 <noreply@anthropic.com>
Claude-Session: https://claude.ai/code/session_015dNTYMnYeuZSNPwTVPoXNf
</commit_message>
<xml_diff>
--- a/oposicion/temario/tercer-ejercicio/3A08.docx
+++ b/oposicion/temario/tercer-ejercicio/3A08.docx
@@ -1255,7 +1255,7 @@
           <w:rPr>
             <w:rStyle w:val="Hyperlink"/>
           </w:rPr>
-          <w:t xml:space="preserve">Kihlstrom, Mas-Colell, y Sonnenschein 1976</w:t>
+          <w:t xml:space="preserve">Kihlstrom, Mas-Colell y Sonnenschein 1976</w:t>
         </w:r>
       </w:hyperlink>
       <w:r>
@@ -4902,7 +4902,7 @@
         <w:t xml:space="preserve"> </w:t>
       </w:r>
       <w:r>
-        <w:t xml:space="preserve">Mas-Colell, Whinston, y Green (</w:t>
+        <w:t xml:space="preserve">Mas-Colell, Whinston y Green (</w:t>
       </w:r>
       <w:hyperlink w:anchor="ref-MasColellWhinstonGreen1995">
         <w:r>
@@ -4991,7 +4991,7 @@
           <w:rPr>
             <w:rStyle w:val="Hyperlink"/>
           </w:rPr>
-          <w:t xml:space="preserve">Mas-Colell, Whinston, y Green 1995, cap. 3</w:t>
+          <w:t xml:space="preserve">Mas-Colell, Whinston y Green 1995, cap. 3</w:t>
         </w:r>
       </w:hyperlink>
       <w:r>
@@ -5234,7 +5234,7 @@
         <w:t xml:space="preserve"> </w:t>
       </w:r>
       <w:r>
-        <w:t xml:space="preserve">Mas-Colell, Whinston, y Green (</w:t>
+        <w:t xml:space="preserve">Mas-Colell, Whinston y Green (</w:t>
       </w:r>
       <w:hyperlink w:anchor="ref-MasColellWhinstonGreen1995">
         <w:r>
@@ -6653,7 +6653,7 @@
           <w:rPr>
             <w:rStyle w:val="Hyperlink"/>
           </w:rPr>
-          <w:t xml:space="preserve">Mas-Colell, Whinston, y Green 1995</w:t>
+          <w:t xml:space="preserve">Mas-Colell, Whinston y Green 1995</w:t>
         </w:r>
       </w:hyperlink>
       <w:r>
@@ -8283,7 +8283,7 @@
           <w:rPr>
             <w:rStyle w:val="Hyperlink"/>
           </w:rPr>
-          <w:t xml:space="preserve">Mas-Colell, Whinston, y Green 1995</w:t>
+          <w:t xml:space="preserve">Mas-Colell, Whinston y Green 1995</w:t>
         </w:r>
       </w:hyperlink>
       <w:r>
@@ -12166,7 +12166,7 @@
         <w:t xml:space="preserve"> </w:t>
       </w:r>
       <w:r>
-        <w:t xml:space="preserve">Besanko, Braeutigam, y Gibbs (</w:t>
+        <w:t xml:space="preserve">Besanko, Braeutigam y Gibbs (</w:t>
       </w:r>
       <w:hyperlink w:anchor="ref-BesankoBraeutigamGibbs2020">
         <w:r>
@@ -12986,7 +12986,7 @@
         <w:t xml:space="preserve"> </w:t>
       </w:r>
       <w:r>
-        <w:t xml:space="preserve">Mas-Colell, Whinston, y Green (</w:t>
+        <w:t xml:space="preserve">Mas-Colell, Whinston y Green (</w:t>
       </w:r>
       <w:hyperlink w:anchor="ref-MasColellWhinstonGreen1995">
         <w:r>
@@ -16755,7 +16755,7 @@
           <w:rPr>
             <w:rStyle w:val="Hyperlink"/>
           </w:rPr>
-          <w:t xml:space="preserve">Mas-Colell, Whinston, y Green 1995</w:t>
+          <w:t xml:space="preserve">Mas-Colell, Whinston y Green 1995</w:t>
         </w:r>
       </w:hyperlink>
       <w:r>
@@ -18379,7 +18379,7 @@
           <w:rPr>
             <w:rStyle w:val="Hyperlink"/>
           </w:rPr>
-          <w:t xml:space="preserve">Mas-Colell, Whinston, y Green 1995</w:t>
+          <w:t xml:space="preserve">Mas-Colell, Whinston y Green 1995</w:t>
         </w:r>
       </w:hyperlink>
       <w:r>
@@ -18803,7 +18803,7 @@
         <w:t xml:space="preserve"> </w:t>
       </w:r>
       <w:r>
-        <w:t xml:space="preserve">Mas-Colell, Whinston, y Green (</w:t>
+        <w:t xml:space="preserve">Mas-Colell, Whinston y Green (</w:t>
       </w:r>
       <w:hyperlink w:anchor="ref-MasColellWhinstonGreen1995">
         <w:r>
@@ -20019,7 +20019,7 @@
         <w:t xml:space="preserve"> </w:t>
       </w:r>
       <w:r>
-        <w:t xml:space="preserve">Mas-Colell, Whinston, y Green (</w:t>
+        <w:t xml:space="preserve">Mas-Colell, Whinston y Green (</w:t>
       </w:r>
       <w:hyperlink w:anchor="ref-MasColellWhinstonGreen1995">
         <w:r>
@@ -25153,7 +25153,7 @@
           <w:i/>
           <w:iCs/>
         </w:rPr>
-        <w:t xml:space="preserve">Mas-Colell, Whinston, y Green (</w:t>
+        <w:t xml:space="preserve">Mas-Colell, Whinston y Green (</w:t>
       </w:r>
       <w:hyperlink w:anchor="ref-MasColellWhinstonGreen1995">
         <w:r>
@@ -25597,7 +25597,7 @@
         <w:t xml:space="preserve"> </w:t>
       </w:r>
       <w:r>
-        <w:t xml:space="preserve">Mas-Colell, Whinston, y Green (</w:t>
+        <w:t xml:space="preserve">Mas-Colell, Whinston y Green (</w:t>
       </w:r>
       <w:hyperlink w:anchor="ref-MasColellWhinstonGreen1995">
         <w:r>
@@ -27301,7 +27301,7 @@
           <w:rPr>
             <w:rStyle w:val="Hyperlink"/>
           </w:rPr>
-          <w:t xml:space="preserve">Mas-Colell, Whinston, y Green 1995</w:t>
+          <w:t xml:space="preserve">Mas-Colell, Whinston y Green 1995</w:t>
         </w:r>
       </w:hyperlink>
       <w:r>
@@ -29047,7 +29047,7 @@
           <w:i/>
           <w:iCs/>
         </w:rPr>
-        <w:t xml:space="preserve">Mas-Colell, Whinston, y Green (</w:t>
+        <w:t xml:space="preserve">Mas-Colell, Whinston y Green (</w:t>
       </w:r>
       <w:hyperlink w:anchor="ref-MasColellWhinstonGreen1995">
         <w:r>
@@ -31398,7 +31398,7 @@
         <w:t xml:space="preserve"> </w:t>
       </w:r>
       <w:r>
-        <w:t xml:space="preserve">Mas-Colell, Whinston, y Green (</w:t>
+        <w:t xml:space="preserve">Mas-Colell, Whinston y Green (</w:t>
       </w:r>
       <w:hyperlink w:anchor="ref-MasColellWhinstonGreen1995">
         <w:r>
@@ -31802,7 +31802,7 @@
           <w:rPr>
             <w:rStyle w:val="Hyperlink"/>
           </w:rPr>
-          <w:t xml:space="preserve">Mas-Colell, Whinston, y Green 1995</w:t>
+          <w:t xml:space="preserve">Mas-Colell, Whinston y Green 1995</w:t>
         </w:r>
       </w:hyperlink>
       <w:r>
@@ -32163,7 +32163,7 @@
           <w:rPr>
             <w:rStyle w:val="Hyperlink"/>
           </w:rPr>
-          <w:t xml:space="preserve">Mas-Colell, Whinston, y Green 1995</w:t>
+          <w:t xml:space="preserve">Mas-Colell, Whinston y Green 1995</w:t>
         </w:r>
       </w:hyperlink>
       <w:r>
@@ -32196,7 +32196,7 @@
         <w:t xml:space="preserve"> </w:t>
       </w:r>
       <w:r>
-        <w:t xml:space="preserve">Kihlstrom, Mas-Colell, y Sonnenschein (</w:t>
+        <w:t xml:space="preserve">Kihlstrom, Mas-Colell y Sonnenschein (</w:t>
       </w:r>
       <w:hyperlink w:anchor="ref-KihlstromMasColellSonnenschein1976">
         <w:r>
@@ -35841,7 +35841,7 @@
           <w:rPr>
             <w:rStyle w:val="Hyperlink"/>
           </w:rPr>
-          <w:t xml:space="preserve">Ekeland, Heckman, y Nesheim 2004</w:t>
+          <w:t xml:space="preserve">Ekeland, Heckman y Nesheim 2004</w:t>
         </w:r>
       </w:hyperlink>
       <w:r>
@@ -37690,7 +37690,7 @@
         <w:t xml:space="preserve"> </w:t>
       </w:r>
       <w:r>
-        <w:t xml:space="preserve">Mas-Colell, Whinston, y Green (</w:t>
+        <w:t xml:space="preserve">Mas-Colell, Whinston y Green (</w:t>
       </w:r>
       <w:hyperlink w:anchor="ref-MasColellWhinstonGreen1995">
         <w:r>
@@ -46320,7 +46320,7 @@
           <w:rPr>
             <w:rStyle w:val="Hyperlink"/>
           </w:rPr>
-          <w:t xml:space="preserve">Mas-Colell, Whinston, y Green 1995</w:t>
+          <w:t xml:space="preserve">Mas-Colell, Whinston y Green 1995</w:t>
         </w:r>
       </w:hyperlink>
       <w:r>
@@ -51054,7 +51054,7 @@
           <w:rPr>
             <w:rStyle w:val="Hyperlink"/>
           </w:rPr>
-          <w:t xml:space="preserve">Christensen, Jorgenson, y Lau 1975</w:t>
+          <w:t xml:space="preserve">Christensen, Jorgenson y Lau 1975</w:t>
         </w:r>
       </w:hyperlink>
       <w:r>
@@ -51509,7 +51509,7 @@
         <w:t xml:space="preserve"> </w:t>
       </w:r>
       <w:r>
-        <w:t xml:space="preserve">King, Plosser, y Rebelo (</w:t>
+        <w:t xml:space="preserve">King, Plosser y Rebelo (</w:t>
       </w:r>
       <w:hyperlink w:anchor="ref-KingPlosserRebelo1988Production">
         <w:r>
@@ -51532,7 +51532,7 @@
         <w:t xml:space="preserve"> </w:t>
       </w:r>
       <w:r>
-        <w:t xml:space="preserve">King, Plosser, y Rebelo (</w:t>
+        <w:t xml:space="preserve">King, Plosser y Rebelo (</w:t>
       </w:r>
       <w:hyperlink w:anchor="ref-KingPlosserRebelo2002Appendix">
         <w:r>
@@ -51907,7 +51907,7 @@
         <w:t xml:space="preserve"> </w:t>
       </w:r>
       <w:r>
-        <w:t xml:space="preserve">Greenwood, Hercowitz, y Huffman (</w:t>
+        <w:t xml:space="preserve">Greenwood, Hercowitz y Huffman (</w:t>
       </w:r>
       <w:hyperlink w:anchor="ref-GreenwoodHercowitzHuffman1988">
         <w:r>
@@ -53758,7 +53758,7 @@
         <w:t xml:space="preserve"> </w:t>
       </w:r>
       <w:r>
-        <w:t xml:space="preserve">Christensen, Jorgenson, y Lau (</w:t>
+        <w:t xml:space="preserve">Christensen, Jorgenson y Lau (</w:t>
       </w:r>
       <w:hyperlink w:anchor="ref-ChristensenJorgensonLau1975Utility">
         <w:r>
@@ -57638,7 +57638,7 @@
           <w:rPr>
             <w:rStyle w:val="Hyperlink"/>
           </w:rPr>
-          <w:t xml:space="preserve">Kahneman, Knetsch, y Thaler 1990</w:t>
+          <w:t xml:space="preserve">Kahneman, Knetsch y Thaler 1990</w:t>
         </w:r>
       </w:hyperlink>
       <w:r>
@@ -57676,7 +57676,7 @@
           <w:rPr>
             <w:rStyle w:val="Hyperlink"/>
           </w:rPr>
-          <w:t xml:space="preserve">Kahneman, Knetsch, y Thaler 1986</w:t>
+          <w:t xml:space="preserve">Kahneman, Knetsch y Thaler 1986</w:t>
         </w:r>
       </w:hyperlink>
       <w:r>
@@ -59605,7 +59605,7 @@
         <w:pStyle w:val="Bibliography"/>
       </w:pPr>
       <w:r>
-        <w:t xml:space="preserve">Aguilar García, Eduardo, y Carolina Mateos Bustamante. 2015.</w:t>
+        <w:t xml:space="preserve">Aguilar García, Eduardo y Carolina Mateos Bustamante. 2015.</w:t>
       </w:r>
       <w:r>
         <w:t xml:space="preserve"> </w:t>
@@ -59674,7 +59674,7 @@
         <w:pStyle w:val="Bibliography"/>
       </w:pPr>
       <w:r>
-        <w:t xml:space="preserve">Arrow, Kenneth J., Hollis B. Chenery, Bagicha S. Minhas, y Robert M. Solow. 1961.</w:t>
+        <w:t xml:space="preserve">Arrow, Kenneth J., Hollis B. Chenery, Bagicha S. Minhas y Robert M. Solow. 1961.</w:t>
       </w:r>
       <w:r>
         <w:t xml:space="preserve"> </w:t>
@@ -59723,7 +59723,7 @@
         <w:pStyle w:val="Bibliography"/>
       </w:pPr>
       <w:r>
-        <w:t xml:space="preserve">Arrow, Kenneth J., y Alain C. Enthoven. 1961.</w:t>
+        <w:t xml:space="preserve">Arrow, Kenneth J. y Alain C. Enthoven. 1961.</w:t>
       </w:r>
       <w:r>
         <w:t xml:space="preserve"> </w:t>
@@ -59977,7 +59977,7 @@
         <w:pStyle w:val="Bibliography"/>
       </w:pPr>
       <w:r>
-        <w:t xml:space="preserve">Besanko, David, Ronald R. Braeutigam, y Michael Gibbs. 2020.</w:t>
+        <w:t xml:space="preserve">Besanko, David, Ronald R. Braeutigam y Michael Gibbs. 2020.</w:t>
       </w:r>
       <w:r>
         <w:t xml:space="preserve"> </w:t>
@@ -60000,7 +60000,7 @@
         <w:pStyle w:val="Bibliography"/>
       </w:pPr>
       <w:r>
-        <w:t xml:space="preserve">Boskin, Michael J., Ellen R. Dulberger, Robert J. Gordon, Zvi Griliches, y Dale W. Jorgenson. 1996.</w:t>
+        <w:t xml:space="preserve">Boskin, Michael J., Ellen R. Dulberger, Robert J. Gordon, Zvi Griliches y Dale W. Jorgenson. 1996.</w:t>
       </w:r>
       <w:r>
         <w:t xml:space="preserve"> </w:t>
@@ -60019,7 +60019,7 @@
         <w:pStyle w:val="Bibliography"/>
       </w:pPr>
       <w:r>
-        <w:t xml:space="preserve">Christensen, Laurits R., Dale W. Jorgenson, y Lawrence J. Lau. 1975.</w:t>
+        <w:t xml:space="preserve">Christensen, Laurits R., Dale W. Jorgenson y Lawrence J. Lau. 1975.</w:t>
       </w:r>
       <w:r>
         <w:t xml:space="preserve"> </w:t>
@@ -60054,7 +60054,7 @@
         <w:pStyle w:val="Bibliography"/>
       </w:pPr>
       <w:r>
-        <w:t xml:space="preserve">Cobb, Charles W., y Paul H. Douglas. 1928.</w:t>
+        <w:t xml:space="preserve">Cobb, Charles W. y Paul H. Douglas. 1928.</w:t>
       </w:r>
       <w:r>
         <w:t xml:space="preserve"> </w:t>
@@ -60184,7 +60184,7 @@
         <w:pStyle w:val="Bibliography"/>
       </w:pPr>
       <w:r>
-        <w:t xml:space="preserve">Deaton, Angus, y John Muellbauer. 1980a.</w:t>
+        <w:t xml:space="preserve">Deaton, Angus y John Muellbauer. 1980a.</w:t>
       </w:r>
       <w:r>
         <w:t xml:space="preserve"> </w:t>
@@ -60369,7 +60369,7 @@
         <w:pStyle w:val="Bibliography"/>
       </w:pPr>
       <w:r>
-        <w:t xml:space="preserve">Ekeland, Ivar, James J. Heckman, y Lars Nesheim. 2004.</w:t>
+        <w:t xml:space="preserve">Ekeland, Ivar, James J. Heckman y Lars Nesheim. 2004.</w:t>
       </w:r>
       <w:r>
         <w:t xml:space="preserve"> </w:t>
@@ -60404,7 +60404,7 @@
         <w:pStyle w:val="Bibliography"/>
       </w:pPr>
       <w:r>
-        <w:t xml:space="preserve">Ekelund, Robert B., y Robert F. Hébert. 2013.</w:t>
+        <w:t xml:space="preserve">Ekelund, Robert B. y Robert F. Hébert. 2013.</w:t>
       </w:r>
       <w:r>
         <w:t xml:space="preserve"> </w:t>
@@ -60855,7 +60855,7 @@
         <w:pStyle w:val="Bibliography"/>
       </w:pPr>
       <w:r>
-        <w:t xml:space="preserve">Greenwood, Jeremy, Zvi Hercowitz, y Gregory W. Huffman. 1988.</w:t>
+        <w:t xml:space="preserve">Greenwood, Jeremy, Zvi Hercowitz y Gregory W. Huffman. 1988.</w:t>
       </w:r>
       <w:r>
         <w:t xml:space="preserve"> </w:t>
@@ -61008,7 +61008,7 @@
         <w:pStyle w:val="Bibliography"/>
       </w:pPr>
       <w:r>
-        <w:t xml:space="preserve">Hicks, John R., y Roy G. D. Allen. 1934.</w:t>
+        <w:t xml:space="preserve">Hicks, John R. y Roy G. D. Allen. 1934.</w:t>
       </w:r>
       <w:r>
         <w:t xml:space="preserve"> </w:t>
@@ -61106,7 +61106,7 @@
         <w:pStyle w:val="Bibliography"/>
       </w:pPr>
       <w:r>
-        <w:t xml:space="preserve">Hurwicz, Leonid, y Hirofumi Uzawa. 1971.</w:t>
+        <w:t xml:space="preserve">Hurwicz, Leonid y Hirofumi Uzawa. 1971.</w:t>
       </w:r>
       <w:r>
         <w:t xml:space="preserve"> </w:t>
@@ -61128,7 +61128,7 @@
         <w:t xml:space="preserve">Preferences, Utility, and Demand</w:t>
       </w:r>
       <w:r>
-        <w:t xml:space="preserve">, editado por John S. Chipman, Leonid Hurwicz, Marcel K. Richter, y Hugo F. Sonnenschein, 114-48. Nueva York: Harcourt Brace Jovanovich.</w:t>
+        <w:t xml:space="preserve">, editado por John S. Chipman, Leonid Hurwicz, Marcel K. Richter y Hugo F. Sonnenschein, 114-48. Nueva York: Harcourt Brace Jovanovich.</w:t>
       </w:r>
     </w:p>
     <w:bookmarkEnd w:id="320"/>
@@ -61369,7 +61369,7 @@
         <w:pStyle w:val="Bibliography"/>
       </w:pPr>
       <w:r>
-        <w:t xml:space="preserve">Jaimovich, Nir, y Sergio Rebelo. 2009.</w:t>
+        <w:t xml:space="preserve">Jaimovich, Nir y Sergio Rebelo. 2009.</w:t>
       </w:r>
       <w:r>
         <w:t xml:space="preserve"> </w:t>
@@ -61415,7 +61415,7 @@
         <w:pStyle w:val="Bibliography"/>
       </w:pPr>
       <w:r>
-        <w:t xml:space="preserve">Jehle, Geoffrey A., y Philip J. Reny. 2011.</w:t>
+        <w:t xml:space="preserve">Jehle, Geoffrey A. y Philip J. Reny. 2011.</w:t>
       </w:r>
       <w:r>
         <w:t xml:space="preserve"> </w:t>
@@ -61438,7 +61438,7 @@
         <w:pStyle w:val="Bibliography"/>
       </w:pPr>
       <w:r>
-        <w:t xml:space="preserve">Jensen, Robert T., y Nolan H. Miller. 2008.</w:t>
+        <w:t xml:space="preserve">Jensen, Robert T. y Nolan H. Miller. 2008.</w:t>
       </w:r>
       <w:r>
         <w:t xml:space="preserve"> </w:t>
@@ -61473,7 +61473,7 @@
         <w:pStyle w:val="Bibliography"/>
       </w:pPr>
       <w:r>
-        <w:t xml:space="preserve">Kahneman, Daniel, Jack L. Knetsch, y Richard H. Thaler. 1986.</w:t>
+        <w:t xml:space="preserve">Kahneman, Daniel, Jack L. Knetsch y Richard H. Thaler. 1986.</w:t>
       </w:r>
       <w:r>
         <w:t xml:space="preserve"> </w:t>
@@ -61557,7 +61557,7 @@
         <w:pStyle w:val="Bibliography"/>
       </w:pPr>
       <w:r>
-        <w:t xml:space="preserve">Kahneman, Daniel, y Amos Tversky. 1979.</w:t>
+        <w:t xml:space="preserve">Kahneman, Daniel y Amos Tversky. 1979.</w:t>
       </w:r>
       <w:r>
         <w:t xml:space="preserve"> </w:t>
@@ -61655,7 +61655,7 @@
         <w:pStyle w:val="Bibliography"/>
       </w:pPr>
       <w:r>
-        <w:t xml:space="preserve">Kihlstrom, Richard, Andreu Mas-Colell, y Hugo Sonnenschein. 1976.</w:t>
+        <w:t xml:space="preserve">Kihlstrom, Richard, Andreu Mas-Colell y Hugo Sonnenschein. 1976.</w:t>
       </w:r>
       <w:r>
         <w:t xml:space="preserve"> </w:t>
@@ -61704,7 +61704,7 @@
         <w:pStyle w:val="Bibliography"/>
       </w:pPr>
       <w:r>
-        <w:t xml:space="preserve">King, Robert G., Charles I. Plosser, y Sergio T. Rebelo. 1988.</w:t>
+        <w:t xml:space="preserve">King, Robert G., Charles I. Plosser y Sergio T. Rebelo. 1988.</w:t>
       </w:r>
       <w:r>
         <w:t xml:space="preserve"> </w:t>
@@ -61802,7 +61802,7 @@
         <w:pStyle w:val="Bibliography"/>
       </w:pPr>
       <w:r>
-        <w:t xml:space="preserve">Kuhn, Harold W., y Albert W. Tucker. 1951.</w:t>
+        <w:t xml:space="preserve">Kuhn, Harold W. y Albert W. Tucker. 1951.</w:t>
       </w:r>
       <w:r>
         <w:t xml:space="preserve"> </w:t>
@@ -62072,7 +62072,7 @@
         <w:pStyle w:val="Bibliography"/>
       </w:pPr>
       <w:r>
-        <w:t xml:space="preserve">Mas-Colell, Andreu, Michael D. Whinston, y Jerry R. Green. 1995.</w:t>
+        <w:t xml:space="preserve">Mas-Colell, Andreu, Michael D. Whinston y Jerry R. Green. 1995.</w:t>
       </w:r>
       <w:r>
         <w:t xml:space="preserve"> </w:t>
@@ -62193,7 +62193,7 @@
         <w:pStyle w:val="Bibliography"/>
       </w:pPr>
       <w:r>
-        <w:t xml:space="preserve">Osborne, Martin J., y Ariel Rubinstein. 2020.</w:t>
+        <w:t xml:space="preserve">Osborne, Martin J. y Ariel Rubinstein. 2020.</w:t>
       </w:r>
       <w:r>
         <w:t xml:space="preserve"> </w:t>
@@ -62935,7 +62935,7 @@
         <w:pStyle w:val="Bibliography"/>
       </w:pPr>
       <w:r>
-        <w:t xml:space="preserve">Sydsæter, Knut, Peter Hammond, Atle Seierstad, y Arne Strøm. 2008.</w:t>
+        <w:t xml:space="preserve">Sydsæter, Knut, Peter Hammond, Atle Seierstad y Arne Strøm. 2008.</w:t>
       </w:r>
       <w:r>
         <w:t xml:space="preserve"> </w:t>
@@ -63241,7 +63241,7 @@
         <w:pStyle w:val="Bibliography"/>
       </w:pPr>
       <w:r>
-        <w:t xml:space="preserve">Tversky, Amos, y Daniel Kahneman. 1981.</w:t>
+        <w:t xml:space="preserve">Tversky, Amos y Daniel Kahneman. 1981.</w:t>
       </w:r>
       <w:r>
         <w:t xml:space="preserve"> </w:t>
@@ -63418,7 +63418,7 @@
         <w:pStyle w:val="Bibliography"/>
       </w:pPr>
       <w:r>
-        <w:t xml:space="preserve">Vial, Bernardita, y Felipe Zurita. 2011.</w:t>
+        <w:t xml:space="preserve">Vial, Bernardita y Felipe Zurita. 2011.</w:t>
       </w:r>
       <w:r>
         <w:t xml:space="preserve"> </w:t>
@@ -63982,7 +63982,7 @@
           <w:rPr>
             <w:rStyle w:val="Hyperlink"/>
           </w:rPr>
-          <w:t xml:space="preserve">Mas-Colell, Whinston, y Green 1995, párr. 2.C</w:t>
+          <w:t xml:space="preserve">Mas-Colell, Whinston y Green 1995, párr. 2.C</w:t>
         </w:r>
       </w:hyperlink>
       <w:r>
@@ -64584,7 +64584,7 @@
         <w:t xml:space="preserve"> </w:t>
       </w:r>
       <w:r>
-        <w:t xml:space="preserve">Mas-Colell, Whinston, y Green (</w:t>
+        <w:t xml:space="preserve">Mas-Colell, Whinston y Green (</w:t>
       </w:r>
       <w:hyperlink w:anchor="ref-MasColellWhinstonGreen1995">
         <w:r>
@@ -64636,7 +64636,7 @@
         <w:t xml:space="preserve">, llamadas así por analogía con la ordenación de las palabras en un diccionario, el consumidor prefiere siempre la cesta con más cantidad del primer bien, sea cual sea la del resto; solo si ambas tienen la misma cantidad del primero mira el segundo, y así sucesivamente. Cumplen el preorden completo y la monotonía estricta, y generan una función de demanda, pero no admiten función de utilidad (</w:t>
       </w:r>
       <w:r>
-        <w:t xml:space="preserve">Mas-Colell, Whinston, y Green (</w:t>
+        <w:t xml:space="preserve">Mas-Colell, Whinston y Green (</w:t>
       </w:r>
       <w:hyperlink w:anchor="ref-MasColellWhinstonGreen1995">
         <w:r>
@@ -64731,7 +64731,7 @@
           <w:rPr>
             <w:rStyle w:val="Hyperlink"/>
           </w:rPr>
-          <w:t xml:space="preserve">Mas-Colell, Whinston, y Green 1995, cap. 16</w:t>
+          <w:t xml:space="preserve">Mas-Colell, Whinston y Green 1995, cap. 16</w:t>
         </w:r>
       </w:hyperlink>
       <w:r>
@@ -65042,7 +65042,7 @@
         <w:t xml:space="preserve"> </w:t>
       </w:r>
       <w:r>
-        <w:t xml:space="preserve">Mas-Colell, Whinston, y Green (</w:t>
+        <w:t xml:space="preserve">Mas-Colell, Whinston y Green (</w:t>
       </w:r>
       <w:hyperlink w:anchor="ref-MasColellWhinstonGreen1995">
         <w:r>
@@ -65347,7 +65347,7 @@
         <w:t xml:space="preserve"> </w:t>
       </w:r>
       <w:r>
-        <w:t xml:space="preserve">Mas-Colell, Whinston, y Green (</w:t>
+        <w:t xml:space="preserve">Mas-Colell, Whinston y Green (</w:t>
       </w:r>
       <w:hyperlink w:anchor="ref-MasColellWhinstonGreen1995">
         <w:r>
@@ -66779,7 +66779,7 @@
         <w:t xml:space="preserve"> </w:t>
       </w:r>
       <w:r>
-        <w:t xml:space="preserve">Mas-Colell, Whinston, y Green (</w:t>
+        <w:t xml:space="preserve">Mas-Colell, Whinston y Green (</w:t>
       </w:r>
       <w:hyperlink w:anchor="ref-MasColellWhinstonGreen1995">
         <w:r>
@@ -68234,7 +68234,7 @@
           <w:rPr>
             <w:rStyle w:val="Hyperlink"/>
           </w:rPr>
-          <w:t xml:space="preserve">Mas-Colell, Whinston, y Green 1995, párr. 3.J</w:t>
+          <w:t xml:space="preserve">Mas-Colell, Whinston y Green 1995, párr. 3.J</w:t>
         </w:r>
       </w:hyperlink>
       <w:r>

</xml_diff>

<commit_message>
Tema 3.A.9 revisado: dualidad, sistemas de demanda y medidas de bienestar, sin repetir el 3.A.8
- Reparto con el 3.A.8: el primal se resume con remisión; se desarrollan el
  dual, Shephard, Slutsky, la integrabilidad (teorema de Frobenius), los
  sistemas de demanda (LES, Rotterdam, translog, AIDS completo y QUAIDS, con
  su valoración) y las medidas de bienestar (métrica monetaria, Willig,
  Hausman, ordenación demostrada; Konüs, Fisher y Törnqvist; sesgo del IPC).
- Errores corregidos (Frobenius, Shephard, Dupuit 1844, Hicks y Willig, ley de
  Walras); datos al día: IPC base 2025, EPF 2025, deflactor, pensiones 2026.
- 7 gráficos TikZ; PDF de 37 páginas, HTML y Word; canon al día.
- Web: las figuras llevan el ancho del tema (pandoc-macros) y 3.A.8 y 3.A.11
  se reconstruyen con los arreglos comunes.

Co-Authored-By: Claude Opus 5.5 <noreply@anthropic.com>
Claude-Session: https://claude.ai/code/session_015dNTYMnYeuZSNPwTVPoXNf
</commit_message>
<xml_diff>
--- a/oposicion/temario/tercer-ejercicio/3A08.docx
+++ b/oposicion/temario/tercer-ejercicio/3A08.docx
@@ -1904,7 +1904,7 @@
       <w:r>
         <w:drawing>
           <wp:inline>
-            <wp:extent cx="5969000" cy="2135412"/>
+            <wp:extent cx="5372100" cy="1921871"/>
             <wp:effectExtent b="0" l="0" r="0" t="0"/>
             <wp:docPr descr="" title="" id="30" name="Picture"/>
             <a:graphic>
@@ -1925,7 +1925,7 @@
                   <pic:spPr bwMode="auto">
                     <a:xfrm>
                       <a:off x="0" y="0"/>
-                      <a:ext cx="5969000" cy="2135412"/>
+                      <a:ext cx="5372100" cy="1921871"/>
                     </a:xfrm>
                     <a:prstGeom prst="rect">
                       <a:avLst/>
@@ -7570,7 +7570,7 @@
       <w:r>
         <w:drawing>
           <wp:inline>
-            <wp:extent cx="5942070" cy="4620931"/>
+            <wp:extent cx="5073650" cy="3945591"/>
             <wp:effectExtent b="0" l="0" r="0" t="0"/>
             <wp:docPr descr="" title="" id="62" name="Picture"/>
             <a:graphic>
@@ -7591,7 +7591,7 @@
                   <pic:spPr bwMode="auto">
                     <a:xfrm>
                       <a:off x="0" y="0"/>
-                      <a:ext cx="5942070" cy="4620931"/>
+                      <a:ext cx="5073650" cy="3945591"/>
                     </a:xfrm>
                     <a:prstGeom prst="rect">
                       <a:avLst/>
@@ -9238,7 +9238,7 @@
       <w:r>
         <w:drawing>
           <wp:inline>
-            <wp:extent cx="5969000" cy="1859524"/>
+            <wp:extent cx="5073650" cy="1580596"/>
             <wp:effectExtent b="0" l="0" r="0" t="0"/>
             <wp:docPr descr="" title="" id="76" name="Picture"/>
             <a:graphic>
@@ -9259,7 +9259,7 @@
                   <pic:spPr bwMode="auto">
                     <a:xfrm>
                       <a:off x="0" y="0"/>
-                      <a:ext cx="5969000" cy="1859524"/>
+                      <a:ext cx="5073650" cy="1580596"/>
                     </a:xfrm>
                     <a:prstGeom prst="rect">
                       <a:avLst/>
@@ -32810,7 +32810,7 @@
       <w:r>
         <w:drawing>
           <wp:inline>
-            <wp:extent cx="3682065" cy="2113212"/>
+            <wp:extent cx="3282950" cy="1884151"/>
             <wp:effectExtent b="0" l="0" r="0" t="0"/>
             <wp:docPr descr="" title="" id="189" name="Picture"/>
             <a:graphic>
@@ -32831,7 +32831,7 @@
                   <pic:spPr bwMode="auto">
                     <a:xfrm>
                       <a:off x="0" y="0"/>
-                      <a:ext cx="3682065" cy="2113212"/>
+                      <a:ext cx="3282950" cy="1884151"/>
                     </a:xfrm>
                     <a:prstGeom prst="rect">
                       <a:avLst/>
@@ -37638,7 +37638,7 @@
       <w:r>
         <w:drawing>
           <wp:inline>
-            <wp:extent cx="5027670" cy="3052077"/>
+            <wp:extent cx="4775200" cy="2898813"/>
             <wp:effectExtent b="0" l="0" r="0" t="0"/>
             <wp:docPr descr="" title="" id="217" name="Picture"/>
             <a:graphic>
@@ -37659,7 +37659,7 @@
                   <pic:spPr bwMode="auto">
                     <a:xfrm>
                       <a:off x="0" y="0"/>
-                      <a:ext cx="5027670" cy="3052077"/>
+                      <a:ext cx="4775200" cy="2898813"/>
                     </a:xfrm>
                     <a:prstGeom prst="rect">
                       <a:avLst/>

</xml_diff>